<commit_message>
Thêm lại báo cáo
</commit_message>
<xml_diff>
--- a/BAOCAO.NET.docx
+++ b/BAOCAO.NET.docx
@@ -2,6 +2,11 @@
 <file path=word/document.xml><?xml version="1.0" encoding="utf-8"?>
 <w:document xmlns:wpc="http://schemas.microsoft.com/office/word/2010/wordprocessingCanvas" xmlns:cx="http://schemas.microsoft.com/office/drawing/2014/chartex" xmlns:cx1="http://schemas.microsoft.com/office/drawing/2015/9/8/chartex" xmlns:cx2="http://schemas.microsoft.com/office/drawing/2015/10/21/chartex" xmlns:cx3="http://schemas.microsoft.com/office/drawing/2016/5/9/chartex" xmlns:cx4="http://schemas.microsoft.com/office/drawing/2016/5/10/chartex" xmlns:cx5="http://schemas.microsoft.com/office/drawing/2016/5/11/chartex" xmlns:cx6="http://schemas.microsoft.com/office/drawing/2016/5/12/chartex" xmlns:cx7="http://schemas.microsoft.com/office/drawing/2016/5/13/chartex" xmlns:cx8="http://schemas.microsoft.com/office/drawing/2016/5/14/chartex" xmlns:mc="http://schemas.openxmlformats.org/markup-compatibility/2006" xmlns:aink="http://schemas.microsoft.com/office/drawing/2016/ink" xmlns:am3d="http://schemas.microsoft.com/office/drawing/2017/model3d" xmlns:o="urn:schemas-microsoft-com:office:office" xmlns:oel="http://schemas.microsoft.com/office/2019/extlst" xmlns:r="http://schemas.openxmlformats.org/officeDocument/2006/relationships" xmlns:m="http://schemas.openxmlformats.org/officeDocument/2006/math" xmlns:v="urn:schemas-microsoft-com:vml" xmlns:wp14="http://schemas.microsoft.com/office/word/2010/wordprocessingDrawing" xmlns:wp="http://schemas.openxmlformats.org/drawingml/2006/wordprocessingDrawing" xmlns:w10="urn:schemas-microsoft-com:office:word" xmlns:w="http://schemas.openxmlformats.org/wordprocessingml/2006/main" xmlns:w14="http://schemas.microsoft.com/office/word/2010/wordml" xmlns:w15="http://schemas.microsoft.com/office/word/2012/wordml" xmlns:w16cex="http://schemas.microsoft.com/office/word/2018/wordml/cex" xmlns:w16cid="http://schemas.microsoft.com/office/word/2016/wordml/cid" xmlns:w16="http://schemas.microsoft.com/office/word/2018/wordml" xmlns:w16du="http://schemas.microsoft.com/office/word/2023/wordml/word16du" xmlns:w16sdtdh="http://schemas.microsoft.com/office/word/2020/wordml/sdtdatahash" xmlns:w16sdtfl="http://schemas.microsoft.com/office/word/2024/wordml/sdtformatlock" xmlns:w16se="http://schemas.microsoft.com/office/word/2015/wordml/symex" xmlns:wpg="http://schemas.microsoft.com/office/word/2010/wordprocessingGroup" xmlns:wpi="http://schemas.microsoft.com/office/word/2010/wordprocessingInk" xmlns:wne="http://schemas.microsoft.com/office/word/2006/wordml" xmlns:wps="http://schemas.microsoft.com/office/word/2010/wordprocessingShape" mc:Ignorable="w14 w15 w16se w16cid w16 w16cex w16sdtdh w16sdtfl w16du wp14">
   <w:body>
+    <w:p>
+      <w:pPr>
+        <w:pStyle w:val="TOCHeading2"/>
+      </w:pPr>
+    </w:p>
     <w:sdt>
       <w:sdtPr>
         <w:rPr>
@@ -12,7 +17,7 @@
           <w:szCs w:val="24"/>
           <w14:ligatures w14:val="standardContextual"/>
         </w:rPr>
-        <w:id w:val="-462809267"/>
+        <w:id w:val="-1232455156"/>
         <w:docPartObj>
           <w:docPartGallery w:val="Table of Contents"/>
           <w:docPartUnique/>
@@ -27,26 +32,52 @@
       <w:sdtContent>
         <w:p>
           <w:pPr>
-            <w:pStyle w:val="TOCHeading2"/>
-            <w:ind w:left="3600" w:firstLine="720"/>
-          </w:pPr>
-        </w:p>
-        <w:p>
-          <w:pPr>
-            <w:pStyle w:val="TOCHeading2"/>
-            <w:ind w:left="3600" w:firstLine="720"/>
+            <w:pStyle w:val="TOCHeading3"/>
             <w:rPr>
               <w:lang w:val="vi-VN"/>
             </w:rPr>
           </w:pPr>
           <w:r>
-            <w:t>Mục</w:t>
+            <w:rPr>
+              <w:lang w:val="vi-VN"/>
+            </w:rPr>
+            <w:tab/>
           </w:r>
           <w:r>
             <w:rPr>
               <w:lang w:val="vi-VN"/>
             </w:rPr>
-            <w:t xml:space="preserve"> lục</w:t>
+            <w:tab/>
+          </w:r>
+          <w:r>
+            <w:rPr>
+              <w:lang w:val="vi-VN"/>
+            </w:rPr>
+            <w:tab/>
+          </w:r>
+          <w:r>
+            <w:rPr>
+              <w:lang w:val="vi-VN"/>
+            </w:rPr>
+            <w:tab/>
+          </w:r>
+          <w:r>
+            <w:rPr>
+              <w:lang w:val="vi-VN"/>
+            </w:rPr>
+            <w:tab/>
+          </w:r>
+          <w:r>
+            <w:rPr>
+              <w:lang w:val="vi-VN"/>
+            </w:rPr>
+            <w:tab/>
+          </w:r>
+          <w:r>
+            <w:rPr>
+              <w:lang w:val="vi-VN"/>
+            </w:rPr>
+            <w:t>Mục lục</w:t>
           </w:r>
         </w:p>
         <w:p>
@@ -70,7 +101,7 @@
           <w:r>
             <w:fldChar w:fldCharType="separate"/>
           </w:r>
-          <w:hyperlink w:anchor="_Toc189742662" w:history="1">
+          <w:hyperlink w:anchor="_Toc190004451" w:history="1">
             <w:r>
               <w:rPr>
                 <w:rStyle w:val="Hyperlink"/>
@@ -97,7 +128,7 @@
               <w:fldChar w:fldCharType="begin"/>
             </w:r>
             <w:r>
-              <w:instrText xml:space="preserve"> PAGEREF _Toc189742662 \h </w:instrText>
+              <w:instrText xml:space="preserve"> PAGEREF _Toc190004451 \h </w:instrText>
             </w:r>
             <w:r>
               <w:fldChar w:fldCharType="separate"/>
@@ -122,7 +153,7 @@
               <w:sz w:val="24"/>
             </w:rPr>
           </w:pPr>
-          <w:hyperlink w:anchor="_Toc189742663" w:history="1">
+          <w:hyperlink w:anchor="_Toc190004452" w:history="1">
             <w:r>
               <w:rPr>
                 <w:rStyle w:val="Hyperlink"/>
@@ -149,7 +180,7 @@
               <w:fldChar w:fldCharType="begin"/>
             </w:r>
             <w:r>
-              <w:instrText xml:space="preserve"> PAGEREF _Toc189742663 \h </w:instrText>
+              <w:instrText xml:space="preserve"> PAGEREF _Toc190004452 \h </w:instrText>
             </w:r>
             <w:r>
               <w:fldChar w:fldCharType="separate"/>
@@ -174,7 +205,7 @@
               <w:sz w:val="24"/>
             </w:rPr>
           </w:pPr>
-          <w:hyperlink w:anchor="_Toc189742664" w:history="1">
+          <w:hyperlink w:anchor="_Toc190004453" w:history="1">
             <w:r>
               <w:rPr>
                 <w:rStyle w:val="Hyperlink"/>
@@ -201,7 +232,7 @@
               <w:fldChar w:fldCharType="begin"/>
             </w:r>
             <w:r>
-              <w:instrText xml:space="preserve"> PAGEREF _Toc189742664 \h </w:instrText>
+              <w:instrText xml:space="preserve"> PAGEREF _Toc190004453 \h </w:instrText>
             </w:r>
             <w:r>
               <w:fldChar w:fldCharType="separate"/>
@@ -226,7 +257,7 @@
               <w:sz w:val="24"/>
             </w:rPr>
           </w:pPr>
-          <w:hyperlink w:anchor="_Toc189742665" w:history="1">
+          <w:hyperlink w:anchor="_Toc190004454" w:history="1">
             <w:r>
               <w:rPr>
                 <w:rStyle w:val="Hyperlink"/>
@@ -254,7 +285,7 @@
               <w:fldChar w:fldCharType="begin"/>
             </w:r>
             <w:r>
-              <w:instrText xml:space="preserve"> PAGEREF _Toc189742665 \h </w:instrText>
+              <w:instrText xml:space="preserve"> PAGEREF _Toc190004454 \h </w:instrText>
             </w:r>
             <w:r>
               <w:fldChar w:fldCharType="separate"/>
@@ -279,7 +310,7 @@
               <w:sz w:val="24"/>
             </w:rPr>
           </w:pPr>
-          <w:hyperlink w:anchor="_Toc189742666" w:history="1">
+          <w:hyperlink w:anchor="_Toc190004455" w:history="1">
             <w:r>
               <w:rPr>
                 <w:rStyle w:val="Hyperlink"/>
@@ -306,7 +337,7 @@
               <w:fldChar w:fldCharType="begin"/>
             </w:r>
             <w:r>
-              <w:instrText xml:space="preserve"> PAGEREF _Toc189742666 \h </w:instrText>
+              <w:instrText xml:space="preserve"> PAGEREF _Toc190004455 \h </w:instrText>
             </w:r>
             <w:r>
               <w:fldChar w:fldCharType="separate"/>
@@ -331,7 +362,7 @@
               <w:sz w:val="24"/>
             </w:rPr>
           </w:pPr>
-          <w:hyperlink w:anchor="_Toc189742667" w:history="1">
+          <w:hyperlink w:anchor="_Toc190004456" w:history="1">
             <w:r>
               <w:rPr>
                 <w:rStyle w:val="Hyperlink"/>
@@ -358,7 +389,7 @@
               <w:fldChar w:fldCharType="begin"/>
             </w:r>
             <w:r>
-              <w:instrText xml:space="preserve"> PAGEREF _Toc189742667 \h </w:instrText>
+              <w:instrText xml:space="preserve"> PAGEREF _Toc190004456 \h </w:instrText>
             </w:r>
             <w:r>
               <w:fldChar w:fldCharType="separate"/>
@@ -383,7 +414,7 @@
               <w:sz w:val="24"/>
             </w:rPr>
           </w:pPr>
-          <w:hyperlink w:anchor="_Toc189742668" w:history="1">
+          <w:hyperlink w:anchor="_Toc190004457" w:history="1">
             <w:r>
               <w:rPr>
                 <w:rStyle w:val="Hyperlink"/>
@@ -410,7 +441,7 @@
               <w:fldChar w:fldCharType="begin"/>
             </w:r>
             <w:r>
-              <w:instrText xml:space="preserve"> PAGEREF _Toc189742668 \h </w:instrText>
+              <w:instrText xml:space="preserve"> PAGEREF _Toc190004457 \h </w:instrText>
             </w:r>
             <w:r>
               <w:fldChar w:fldCharType="separate"/>
@@ -435,7 +466,7 @@
               <w:sz w:val="24"/>
             </w:rPr>
           </w:pPr>
-          <w:hyperlink w:anchor="_Toc189742669" w:history="1">
+          <w:hyperlink w:anchor="_Toc190004458" w:history="1">
             <w:r>
               <w:rPr>
                 <w:rStyle w:val="Hyperlink"/>
@@ -462,7 +493,7 @@
               <w:fldChar w:fldCharType="begin"/>
             </w:r>
             <w:r>
-              <w:instrText xml:space="preserve"> PAGEREF _Toc189742669 \h </w:instrText>
+              <w:instrText xml:space="preserve"> PAGEREF _Toc190004458 \h </w:instrText>
             </w:r>
             <w:r>
               <w:fldChar w:fldCharType="separate"/>
@@ -487,7 +518,7 @@
               <w:sz w:val="24"/>
             </w:rPr>
           </w:pPr>
-          <w:hyperlink w:anchor="_Toc189742670" w:history="1">
+          <w:hyperlink w:anchor="_Toc190004459" w:history="1">
             <w:r>
               <w:rPr>
                 <w:rStyle w:val="Hyperlink"/>
@@ -514,7 +545,7 @@
               <w:fldChar w:fldCharType="begin"/>
             </w:r>
             <w:r>
-              <w:instrText xml:space="preserve"> PAGEREF _Toc189742670 \h </w:instrText>
+              <w:instrText xml:space="preserve"> PAGEREF _Toc190004459 \h </w:instrText>
             </w:r>
             <w:r>
               <w:fldChar w:fldCharType="separate"/>
@@ -539,7 +570,7 @@
               <w:sz w:val="24"/>
             </w:rPr>
           </w:pPr>
-          <w:hyperlink w:anchor="_Toc189742671" w:history="1">
+          <w:hyperlink w:anchor="_Toc190004460" w:history="1">
             <w:r>
               <w:rPr>
                 <w:rStyle w:val="Hyperlink"/>
@@ -566,7 +597,7 @@
               <w:fldChar w:fldCharType="begin"/>
             </w:r>
             <w:r>
-              <w:instrText xml:space="preserve"> PAGEREF _Toc189742671 \h </w:instrText>
+              <w:instrText xml:space="preserve"> PAGEREF _Toc190004460 \h </w:instrText>
             </w:r>
             <w:r>
               <w:fldChar w:fldCharType="separate"/>
@@ -591,7 +622,7 @@
               <w:sz w:val="24"/>
             </w:rPr>
           </w:pPr>
-          <w:hyperlink w:anchor="_Toc189742672" w:history="1">
+          <w:hyperlink w:anchor="_Toc190004461" w:history="1">
             <w:r>
               <w:rPr>
                 <w:rStyle w:val="Hyperlink"/>
@@ -619,7 +650,7 @@
               <w:fldChar w:fldCharType="begin"/>
             </w:r>
             <w:r>
-              <w:instrText xml:space="preserve"> PAGEREF _Toc189742672 \h </w:instrText>
+              <w:instrText xml:space="preserve"> PAGEREF _Toc190004461 \h </w:instrText>
             </w:r>
             <w:r>
               <w:fldChar w:fldCharType="separate"/>
@@ -644,7 +675,7 @@
               <w:sz w:val="24"/>
             </w:rPr>
           </w:pPr>
-          <w:hyperlink w:anchor="_Toc189742673" w:history="1">
+          <w:hyperlink w:anchor="_Toc190004462" w:history="1">
             <w:r>
               <w:rPr>
                 <w:rStyle w:val="Hyperlink"/>
@@ -671,7 +702,7 @@
               <w:fldChar w:fldCharType="begin"/>
             </w:r>
             <w:r>
-              <w:instrText xml:space="preserve"> PAGEREF _Toc189742673 \h </w:instrText>
+              <w:instrText xml:space="preserve"> PAGEREF _Toc190004462 \h </w:instrText>
             </w:r>
             <w:r>
               <w:fldChar w:fldCharType="separate"/>
@@ -696,7 +727,7 @@
               <w:sz w:val="24"/>
             </w:rPr>
           </w:pPr>
-          <w:hyperlink w:anchor="_Toc189742674" w:history="1">
+          <w:hyperlink w:anchor="_Toc190004463" w:history="1">
             <w:r>
               <w:rPr>
                 <w:rStyle w:val="Hyperlink"/>
@@ -723,7 +754,7 @@
               <w:fldChar w:fldCharType="begin"/>
             </w:r>
             <w:r>
-              <w:instrText xml:space="preserve"> PAGEREF _Toc189742674 \h </w:instrText>
+              <w:instrText xml:space="preserve"> PAGEREF _Toc190004463 \h </w:instrText>
             </w:r>
             <w:r>
               <w:fldChar w:fldCharType="separate"/>
@@ -748,7 +779,7 @@
               <w:sz w:val="24"/>
             </w:rPr>
           </w:pPr>
-          <w:hyperlink w:anchor="_Toc189742675" w:history="1">
+          <w:hyperlink w:anchor="_Toc190004464" w:history="1">
             <w:r>
               <w:rPr>
                 <w:rStyle w:val="Hyperlink"/>
@@ -775,7 +806,7 @@
               <w:fldChar w:fldCharType="begin"/>
             </w:r>
             <w:r>
-              <w:instrText xml:space="preserve"> PAGEREF _Toc189742675 \h </w:instrText>
+              <w:instrText xml:space="preserve"> PAGEREF _Toc190004464 \h </w:instrText>
             </w:r>
             <w:r>
               <w:fldChar w:fldCharType="separate"/>
@@ -800,7 +831,7 @@
               <w:sz w:val="24"/>
             </w:rPr>
           </w:pPr>
-          <w:hyperlink w:anchor="_Toc189742676" w:history="1">
+          <w:hyperlink w:anchor="_Toc190004465" w:history="1">
             <w:r>
               <w:rPr>
                 <w:rStyle w:val="Hyperlink"/>
@@ -827,7 +858,7 @@
               <w:fldChar w:fldCharType="begin"/>
             </w:r>
             <w:r>
-              <w:instrText xml:space="preserve"> PAGEREF _Toc189742676 \h </w:instrText>
+              <w:instrText xml:space="preserve"> PAGEREF _Toc190004465 \h </w:instrText>
             </w:r>
             <w:r>
               <w:fldChar w:fldCharType="separate"/>
@@ -852,7 +883,7 @@
               <w:sz w:val="24"/>
             </w:rPr>
           </w:pPr>
-          <w:hyperlink w:anchor="_Toc189742677" w:history="1">
+          <w:hyperlink w:anchor="_Toc190004466" w:history="1">
             <w:r>
               <w:rPr>
                 <w:rStyle w:val="Hyperlink"/>
@@ -879,7 +910,7 @@
               <w:fldChar w:fldCharType="begin"/>
             </w:r>
             <w:r>
-              <w:instrText xml:space="preserve"> PAGEREF _Toc189742677 \h </w:instrText>
+              <w:instrText xml:space="preserve"> PAGEREF _Toc190004466 \h </w:instrText>
             </w:r>
             <w:r>
               <w:fldChar w:fldCharType="separate"/>
@@ -904,7 +935,7 @@
               <w:sz w:val="24"/>
             </w:rPr>
           </w:pPr>
-          <w:hyperlink w:anchor="_Toc189742678" w:history="1">
+          <w:hyperlink w:anchor="_Toc190004467" w:history="1">
             <w:r>
               <w:rPr>
                 <w:rStyle w:val="Hyperlink"/>
@@ -931,7 +962,7 @@
               <w:fldChar w:fldCharType="begin"/>
             </w:r>
             <w:r>
-              <w:instrText xml:space="preserve"> PAGEREF _Toc189742678 \h </w:instrText>
+              <w:instrText xml:space="preserve"> PAGEREF _Toc190004467 \h </w:instrText>
             </w:r>
             <w:r>
               <w:fldChar w:fldCharType="separate"/>
@@ -956,7 +987,7 @@
               <w:sz w:val="24"/>
             </w:rPr>
           </w:pPr>
-          <w:hyperlink w:anchor="_Toc189742679" w:history="1">
+          <w:hyperlink w:anchor="_Toc190004468" w:history="1">
             <w:r>
               <w:rPr>
                 <w:rStyle w:val="Hyperlink"/>
@@ -983,7 +1014,7 @@
               <w:fldChar w:fldCharType="begin"/>
             </w:r>
             <w:r>
-              <w:instrText xml:space="preserve"> PAGEREF _Toc189742679 \h </w:instrText>
+              <w:instrText xml:space="preserve"> PAGEREF _Toc190004468 \h </w:instrText>
             </w:r>
             <w:r>
               <w:fldChar w:fldCharType="separate"/>
@@ -1008,7 +1039,7 @@
               <w:sz w:val="24"/>
             </w:rPr>
           </w:pPr>
-          <w:hyperlink w:anchor="_Toc189742680" w:history="1">
+          <w:hyperlink w:anchor="_Toc190004469" w:history="1">
             <w:r>
               <w:rPr>
                 <w:rStyle w:val="Hyperlink"/>
@@ -1035,13 +1066,13 @@
               <w:fldChar w:fldCharType="begin"/>
             </w:r>
             <w:r>
-              <w:instrText xml:space="preserve"> PAGEREF _Toc189742680 \h </w:instrText>
+              <w:instrText xml:space="preserve"> PAGEREF _Toc190004469 \h </w:instrText>
             </w:r>
             <w:r>
               <w:fldChar w:fldCharType="separate"/>
             </w:r>
             <w:r>
-              <w:t>9</w:t>
+              <w:t>10</w:t>
             </w:r>
             <w:r>
               <w:fldChar w:fldCharType="end"/>
@@ -1060,7 +1091,7 @@
               <w:sz w:val="24"/>
             </w:rPr>
           </w:pPr>
-          <w:hyperlink w:anchor="_Toc189742681" w:history="1">
+          <w:hyperlink w:anchor="_Toc190004470" w:history="1">
             <w:r>
               <w:rPr>
                 <w:rStyle w:val="Hyperlink"/>
@@ -1087,7 +1118,7 @@
               <w:fldChar w:fldCharType="begin"/>
             </w:r>
             <w:r>
-              <w:instrText xml:space="preserve"> PAGEREF _Toc189742681 \h </w:instrText>
+              <w:instrText xml:space="preserve"> PAGEREF _Toc190004470 \h </w:instrText>
             </w:r>
             <w:r>
               <w:fldChar w:fldCharType="separate"/>
@@ -1112,7 +1143,7 @@
               <w:sz w:val="24"/>
             </w:rPr>
           </w:pPr>
-          <w:hyperlink w:anchor="_Toc189742682" w:history="1">
+          <w:hyperlink w:anchor="_Toc190004471" w:history="1">
             <w:r>
               <w:rPr>
                 <w:rStyle w:val="Hyperlink"/>
@@ -1139,13 +1170,13 @@
               <w:fldChar w:fldCharType="begin"/>
             </w:r>
             <w:r>
-              <w:instrText xml:space="preserve"> PAGEREF _Toc189742682 \h </w:instrText>
+              <w:instrText xml:space="preserve"> PAGEREF _Toc190004471 \h </w:instrText>
             </w:r>
             <w:r>
               <w:fldChar w:fldCharType="separate"/>
             </w:r>
             <w:r>
-              <w:t>10</w:t>
+              <w:t>11</w:t>
             </w:r>
             <w:r>
               <w:fldChar w:fldCharType="end"/>
@@ -1164,7 +1195,7 @@
               <w:sz w:val="24"/>
             </w:rPr>
           </w:pPr>
-          <w:hyperlink w:anchor="_Toc189742683" w:history="1">
+          <w:hyperlink w:anchor="_Toc190004472" w:history="1">
             <w:r>
               <w:rPr>
                 <w:rStyle w:val="Hyperlink"/>
@@ -1191,7 +1222,7 @@
               <w:fldChar w:fldCharType="begin"/>
             </w:r>
             <w:r>
-              <w:instrText xml:space="preserve"> PAGEREF _Toc189742683 \h </w:instrText>
+              <w:instrText xml:space="preserve"> PAGEREF _Toc190004472 \h </w:instrText>
             </w:r>
             <w:r>
               <w:fldChar w:fldCharType="separate"/>
@@ -1216,7 +1247,7 @@
               <w:sz w:val="24"/>
             </w:rPr>
           </w:pPr>
-          <w:hyperlink w:anchor="_Toc189742684" w:history="1">
+          <w:hyperlink w:anchor="_Toc190004473" w:history="1">
             <w:r>
               <w:rPr>
                 <w:rStyle w:val="Hyperlink"/>
@@ -1243,7 +1274,7 @@
               <w:fldChar w:fldCharType="begin"/>
             </w:r>
             <w:r>
-              <w:instrText xml:space="preserve"> PAGEREF _Toc189742684 \h </w:instrText>
+              <w:instrText xml:space="preserve"> PAGEREF _Toc190004473 \h </w:instrText>
             </w:r>
             <w:r>
               <w:fldChar w:fldCharType="separate"/>
@@ -1268,7 +1299,7 @@
               <w:sz w:val="24"/>
             </w:rPr>
           </w:pPr>
-          <w:hyperlink w:anchor="_Toc189742685" w:history="1">
+          <w:hyperlink w:anchor="_Toc190004474" w:history="1">
             <w:r>
               <w:rPr>
                 <w:rStyle w:val="Hyperlink"/>
@@ -1295,7 +1326,7 @@
               <w:fldChar w:fldCharType="begin"/>
             </w:r>
             <w:r>
-              <w:instrText xml:space="preserve"> PAGEREF _Toc189742685 \h </w:instrText>
+              <w:instrText xml:space="preserve"> PAGEREF _Toc190004474 \h </w:instrText>
             </w:r>
             <w:r>
               <w:fldChar w:fldCharType="separate"/>
@@ -1320,7 +1351,7 @@
               <w:sz w:val="24"/>
             </w:rPr>
           </w:pPr>
-          <w:hyperlink w:anchor="_Toc189742686" w:history="1">
+          <w:hyperlink w:anchor="_Toc190004475" w:history="1">
             <w:r>
               <w:rPr>
                 <w:rStyle w:val="Hyperlink"/>
@@ -1338,7 +1369,7 @@
               <w:rPr>
                 <w:rStyle w:val="Hyperlink"/>
               </w:rPr>
-              <w:t>Module</w:t>
+              <w:t>MODULE</w:t>
             </w:r>
             <w:r>
               <w:tab/>
@@ -1347,7 +1378,7 @@
               <w:fldChar w:fldCharType="begin"/>
             </w:r>
             <w:r>
-              <w:instrText xml:space="preserve"> PAGEREF _Toc189742686 \h </w:instrText>
+              <w:instrText xml:space="preserve"> PAGEREF _Toc190004475 \h </w:instrText>
             </w:r>
             <w:r>
               <w:fldChar w:fldCharType="separate"/>
@@ -1372,7 +1403,7 @@
               <w:sz w:val="24"/>
             </w:rPr>
           </w:pPr>
-          <w:hyperlink w:anchor="_Toc189742687" w:history="1">
+          <w:hyperlink w:anchor="_Toc190004476" w:history="1">
             <w:r>
               <w:rPr>
                 <w:rStyle w:val="Hyperlink"/>
@@ -1401,7 +1432,7 @@
               <w:fldChar w:fldCharType="begin"/>
             </w:r>
             <w:r>
-              <w:instrText xml:space="preserve"> PAGEREF _Toc189742687 \h </w:instrText>
+              <w:instrText xml:space="preserve"> PAGEREF _Toc190004476 \h </w:instrText>
             </w:r>
             <w:r>
               <w:fldChar w:fldCharType="separate"/>
@@ -1426,7 +1457,7 @@
               <w:sz w:val="24"/>
             </w:rPr>
           </w:pPr>
-          <w:hyperlink w:anchor="_Toc189742688" w:history="1">
+          <w:hyperlink w:anchor="_Toc190004477" w:history="1">
             <w:r>
               <w:rPr>
                 <w:rStyle w:val="Hyperlink"/>
@@ -1446,14 +1477,7 @@
                 <w:rStyle w:val="Hyperlink"/>
                 <w:lang w:val="vi-VN"/>
               </w:rPr>
-              <w:t xml:space="preserve">Erd </w:t>
-            </w:r>
-            <w:r>
-              <w:rPr>
-                <w:rStyle w:val="Hyperlink"/>
-                <w:lang w:val="vi-VN"/>
-              </w:rPr>
-              <w:t>( Entity-Relationship Diagram) – Sơ đồ thực thể quan hệ</w:t>
+              <w:t>ERD( Entity-Relationship Diagram) – Sơ đồ thực thể quan hệ</w:t>
             </w:r>
             <w:r>
               <w:tab/>
@@ -1462,7 +1486,7 @@
               <w:fldChar w:fldCharType="begin"/>
             </w:r>
             <w:r>
-              <w:instrText xml:space="preserve"> PAGEREF _Toc189742688 \h </w:instrText>
+              <w:instrText xml:space="preserve"> PAGEREF _Toc190004477 \h </w:instrText>
             </w:r>
             <w:r>
               <w:fldChar w:fldCharType="separate"/>
@@ -1487,7 +1511,7 @@
               <w:sz w:val="24"/>
             </w:rPr>
           </w:pPr>
-          <w:hyperlink w:anchor="_Toc189742689" w:history="1">
+          <w:hyperlink w:anchor="_Toc190004478" w:history="1">
             <w:r>
               <w:rPr>
                 <w:rStyle w:val="Hyperlink"/>
@@ -1514,7 +1538,7 @@
               <w:fldChar w:fldCharType="begin"/>
             </w:r>
             <w:r>
-              <w:instrText xml:space="preserve"> PAGEREF _Toc189742689 \h </w:instrText>
+              <w:instrText xml:space="preserve"> PAGEREF _Toc190004478 \h </w:instrText>
             </w:r>
             <w:r>
               <w:fldChar w:fldCharType="separate"/>
@@ -1539,7 +1563,7 @@
               <w:sz w:val="24"/>
             </w:rPr>
           </w:pPr>
-          <w:hyperlink w:anchor="_Toc189742690" w:history="1">
+          <w:hyperlink w:anchor="_Toc190004479" w:history="1">
             <w:r>
               <w:rPr>
                 <w:rStyle w:val="Hyperlink"/>
@@ -1559,7 +1583,7 @@
                 <w:rStyle w:val="Hyperlink"/>
                 <w:lang w:val="vi-VN"/>
               </w:rPr>
-              <w:t>Bảng danh sách chức năng</w:t>
+              <w:t>Sơ đồ usecase</w:t>
             </w:r>
             <w:r>
               <w:tab/>
@@ -1568,7 +1592,7 @@
               <w:fldChar w:fldCharType="begin"/>
             </w:r>
             <w:r>
-              <w:instrText xml:space="preserve"> PAGEREF _Toc189742690 \h </w:instrText>
+              <w:instrText xml:space="preserve"> PAGEREF _Toc190004479 \h </w:instrText>
             </w:r>
             <w:r>
               <w:fldChar w:fldCharType="separate"/>
@@ -1593,7 +1617,7 @@
               <w:sz w:val="24"/>
             </w:rPr>
           </w:pPr>
-          <w:hyperlink w:anchor="_Toc189742691" w:history="1">
+          <w:hyperlink w:anchor="_Toc190004480" w:history="1">
             <w:r>
               <w:rPr>
                 <w:rStyle w:val="Hyperlink"/>
@@ -1613,6 +1637,60 @@
                 <w:rStyle w:val="Hyperlink"/>
                 <w:lang w:val="vi-VN"/>
               </w:rPr>
+              <w:t>Bảng danh sách chức năng</w:t>
+            </w:r>
+            <w:r>
+              <w:tab/>
+            </w:r>
+            <w:r>
+              <w:fldChar w:fldCharType="begin"/>
+            </w:r>
+            <w:r>
+              <w:instrText xml:space="preserve"> PAGEREF _Toc190004480 \h </w:instrText>
+            </w:r>
+            <w:r>
+              <w:fldChar w:fldCharType="separate"/>
+            </w:r>
+            <w:r>
+              <w:t>18</w:t>
+            </w:r>
+            <w:r>
+              <w:fldChar w:fldCharType="end"/>
+            </w:r>
+          </w:hyperlink>
+        </w:p>
+        <w:p>
+          <w:pPr>
+            <w:pStyle w:val="TOC2"/>
+            <w:tabs>
+              <w:tab w:val="left" w:pos="1680"/>
+              <w:tab w:val="right" w:leader="dot" w:pos="9350"/>
+            </w:tabs>
+            <w:rPr>
+              <w:rFonts w:asciiTheme="minorHAnsi" w:eastAsiaTheme="minorEastAsia" w:hAnsiTheme="minorHAnsi"/>
+              <w:sz w:val="24"/>
+            </w:rPr>
+          </w:pPr>
+          <w:hyperlink w:anchor="_Toc190004481" w:history="1">
+            <w:r>
+              <w:rPr>
+                <w:rStyle w:val="Hyperlink"/>
+                <w:lang w:val="vi-VN"/>
+              </w:rPr>
+              <w:t>3.5.</w:t>
+            </w:r>
+            <w:r>
+              <w:rPr>
+                <w:rFonts w:asciiTheme="minorHAnsi" w:eastAsiaTheme="minorEastAsia" w:hAnsiTheme="minorHAnsi"/>
+                <w:sz w:val="24"/>
+              </w:rPr>
+              <w:tab/>
+            </w:r>
+            <w:r>
+              <w:rPr>
+                <w:rStyle w:val="Hyperlink"/>
+                <w:lang w:val="vi-VN"/>
+              </w:rPr>
               <w:t>Dfd(data flow diagram) – sơ đồ luồng dữ liệu</w:t>
             </w:r>
             <w:r>
@@ -1622,13 +1700,13 @@
               <w:fldChar w:fldCharType="begin"/>
             </w:r>
             <w:r>
-              <w:instrText xml:space="preserve"> PAGEREF _Toc189742691 \h </w:instrText>
+              <w:instrText xml:space="preserve"> PAGEREF _Toc190004481 \h </w:instrText>
             </w:r>
             <w:r>
               <w:fldChar w:fldCharType="separate"/>
             </w:r>
             <w:r>
-              <w:t>22</w:t>
+              <w:t>23</w:t>
             </w:r>
             <w:r>
               <w:fldChar w:fldCharType="end"/>
@@ -1647,13 +1725,13 @@
               <w:sz w:val="24"/>
             </w:rPr>
           </w:pPr>
-          <w:hyperlink w:anchor="_Toc189742692" w:history="1">
+          <w:hyperlink w:anchor="_Toc190004482" w:history="1">
             <w:r>
               <w:rPr>
                 <w:rStyle w:val="Hyperlink"/>
                 <w:lang w:val="vi-VN"/>
               </w:rPr>
-              <w:t>3.4.1.</w:t>
+              <w:t>3.5.1.</w:t>
             </w:r>
             <w:r>
               <w:rPr>
@@ -1676,13 +1754,13 @@
               <w:fldChar w:fldCharType="begin"/>
             </w:r>
             <w:r>
-              <w:instrText xml:space="preserve"> PAGEREF _Toc189742692 \h </w:instrText>
+              <w:instrText xml:space="preserve"> PAGEREF _Toc190004482 \h </w:instrText>
             </w:r>
             <w:r>
               <w:fldChar w:fldCharType="separate"/>
             </w:r>
             <w:r>
-              <w:t>22</w:t>
+              <w:t>23</w:t>
             </w:r>
             <w:r>
               <w:fldChar w:fldCharType="end"/>
@@ -1701,13 +1779,13 @@
               <w:sz w:val="24"/>
             </w:rPr>
           </w:pPr>
-          <w:hyperlink w:anchor="_Toc189742693" w:history="1">
+          <w:hyperlink w:anchor="_Toc190004483" w:history="1">
             <w:r>
               <w:rPr>
                 <w:rStyle w:val="Hyperlink"/>
                 <w:lang w:val="vi-VN"/>
               </w:rPr>
-              <w:t>3.4.2.</w:t>
+              <w:t>3.5.2.</w:t>
             </w:r>
             <w:r>
               <w:rPr>
@@ -1730,13 +1808,13 @@
               <w:fldChar w:fldCharType="begin"/>
             </w:r>
             <w:r>
-              <w:instrText xml:space="preserve"> PAGEREF _Toc189742693 \h </w:instrText>
+              <w:instrText xml:space="preserve"> PAGEREF _Toc190004483 \h </w:instrText>
             </w:r>
             <w:r>
               <w:fldChar w:fldCharType="separate"/>
             </w:r>
             <w:r>
-              <w:t>23</w:t>
+              <w:t>24</w:t>
             </w:r>
             <w:r>
               <w:fldChar w:fldCharType="end"/>
@@ -1755,13 +1833,13 @@
               <w:sz w:val="24"/>
             </w:rPr>
           </w:pPr>
-          <w:hyperlink w:anchor="_Toc189742694" w:history="1">
+          <w:hyperlink w:anchor="_Toc190004484" w:history="1">
             <w:r>
               <w:rPr>
                 <w:rStyle w:val="Hyperlink"/>
                 <w:lang w:val="vi-VN"/>
               </w:rPr>
-              <w:t>3.4.3.</w:t>
+              <w:t>3.5.3.</w:t>
             </w:r>
             <w:r>
               <w:rPr>
@@ -1790,13 +1868,13 @@
               <w:fldChar w:fldCharType="begin"/>
             </w:r>
             <w:r>
-              <w:instrText xml:space="preserve"> PAGEREF _Toc189742694 \h </w:instrText>
+              <w:instrText xml:space="preserve"> PAGEREF _Toc190004484 \h </w:instrText>
             </w:r>
             <w:r>
               <w:fldChar w:fldCharType="separate"/>
             </w:r>
             <w:r>
-              <w:t>26</w:t>
+              <w:t>27</w:t>
             </w:r>
             <w:r>
               <w:fldChar w:fldCharType="end"/>
@@ -1815,13 +1893,13 @@
               <w:sz w:val="24"/>
             </w:rPr>
           </w:pPr>
-          <w:hyperlink w:anchor="_Toc189742695" w:history="1">
+          <w:hyperlink w:anchor="_Toc190004485" w:history="1">
             <w:r>
               <w:rPr>
                 <w:rStyle w:val="Hyperlink"/>
                 <w:lang w:val="vi-VN"/>
               </w:rPr>
-              <w:t>3.4.4.</w:t>
+              <w:t>3.5.4.</w:t>
             </w:r>
             <w:r>
               <w:rPr>
@@ -1844,32 +1922,18 @@
               <w:fldChar w:fldCharType="begin"/>
             </w:r>
             <w:r>
-              <w:instrText xml:space="preserve"> PAGEREF _Toc189742695 \h </w:instrText>
+              <w:instrText xml:space="preserve"> PAGEREF _Toc190004485 \h </w:instrText>
             </w:r>
             <w:r>
               <w:fldChar w:fldCharType="separate"/>
             </w:r>
             <w:r>
-              <w:t>32</w:t>
+              <w:t>33</w:t>
             </w:r>
             <w:r>
               <w:fldChar w:fldCharType="end"/>
             </w:r>
           </w:hyperlink>
-        </w:p>
-        <w:p>
-          <w:pPr>
-            <w:pStyle w:val="TOC1"/>
-            <w:tabs>
-              <w:tab w:val="left" w:pos="2461"/>
-              <w:tab w:val="right" w:leader="dot" w:pos="9350"/>
-            </w:tabs>
-            <w:rPr>
-              <w:rFonts w:asciiTheme="minorHAnsi" w:eastAsiaTheme="minorEastAsia" w:hAnsiTheme="minorHAnsi"/>
-              <w:sz w:val="24"/>
-              <w:lang w:val="vi-VN"/>
-            </w:rPr>
-          </w:pPr>
         </w:p>
         <w:p>
           <w:r>
@@ -1884,6 +1948,12 @@
     </w:sdt>
     <w:p>
       <w:pPr>
+        <w:pStyle w:val="Heading1"/>
+        <w:numPr>
+          <w:ilvl w:val="0"/>
+          <w:numId w:val="0"/>
+        </w:numPr>
+        <w:jc w:val="left"/>
         <w:rPr>
           <w:lang w:val="vi-VN"/>
         </w:rPr>
@@ -1894,68 +1964,8 @@
         <w:rPr>
           <w:lang w:val="vi-VN"/>
         </w:rPr>
-      </w:pPr>
-    </w:p>
-    <w:p>
-      <w:pPr>
-        <w:rPr>
-          <w:lang w:val="vi-VN"/>
-        </w:rPr>
-      </w:pPr>
-    </w:p>
-    <w:p>
-      <w:pPr>
-        <w:rPr>
-          <w:lang w:val="vi-VN"/>
-        </w:rPr>
-      </w:pPr>
-    </w:p>
-    <w:p>
-      <w:pPr>
-        <w:rPr>
-          <w:lang w:val="vi-VN"/>
-        </w:rPr>
-      </w:pPr>
-    </w:p>
-    <w:p>
-      <w:pPr>
-        <w:rPr>
-          <w:lang w:val="vi-VN"/>
-        </w:rPr>
-      </w:pPr>
-    </w:p>
-    <w:p>
-      <w:pPr>
-        <w:rPr>
-          <w:lang w:val="vi-VN"/>
-        </w:rPr>
-      </w:pPr>
-    </w:p>
-    <w:p>
-      <w:pPr>
-        <w:rPr>
-          <w:lang w:val="vi-VN"/>
-        </w:rPr>
-      </w:pPr>
-    </w:p>
-    <w:p>
-      <w:pPr>
-        <w:rPr>
-          <w:lang w:val="vi-VN"/>
-        </w:rPr>
-      </w:pPr>
-    </w:p>
-    <w:p>
-      <w:pPr>
-        <w:rPr>
-          <w:lang w:val="vi-VN"/>
-        </w:rPr>
-      </w:pPr>
-    </w:p>
-    <w:p>
-      <w:pPr>
-        <w:pStyle w:val="Heading1"/>
         <w:sectPr>
+          <w:footerReference w:type="default" r:id="rId8"/>
           <w:pgSz w:w="12240" w:h="15840"/>
           <w:pgMar w:top="1440" w:right="1440" w:bottom="1440" w:left="1440" w:header="720" w:footer="720" w:gutter="0"/>
           <w:cols w:space="720"/>
@@ -1966,23 +1976,60 @@
     <w:p>
       <w:pPr>
         <w:pStyle w:val="Heading1"/>
+        <w:numPr>
+          <w:ilvl w:val="0"/>
+          <w:numId w:val="0"/>
+        </w:numPr>
+        <w:jc w:val="left"/>
+        <w:sectPr>
+          <w:footerReference w:type="default" r:id="rId9"/>
+          <w:type w:val="continuous"/>
+          <w:pgSz w:w="12240" w:h="15840"/>
+          <w:pgMar w:top="1440" w:right="1440" w:bottom="1440" w:left="1440" w:header="720" w:footer="720" w:gutter="0"/>
+          <w:pgNumType w:start="1"/>
+          <w:cols w:space="720"/>
+          <w:docGrid w:linePitch="360"/>
+        </w:sectPr>
       </w:pPr>
       <w:bookmarkStart w:id="0" w:name="_Toc189742662"/>
-      <w:r>
+    </w:p>
+    <w:p>
+      <w:pPr>
+        <w:pStyle w:val="Heading1"/>
+        <w:sectPr>
+          <w:type w:val="continuous"/>
+          <w:pgSz w:w="12240" w:h="15840"/>
+          <w:pgMar w:top="1440" w:right="1440" w:bottom="1440" w:left="1440" w:header="720" w:footer="720" w:gutter="0"/>
+          <w:pgNumType w:start="1"/>
+          <w:cols w:space="720"/>
+          <w:docGrid w:linePitch="360"/>
+        </w:sectPr>
+      </w:pPr>
+      <w:bookmarkStart w:id="1" w:name="_Toc190004451"/>
+    </w:p>
+    <w:p>
+      <w:pPr>
+        <w:pStyle w:val="Heading1"/>
+      </w:pPr>
+      <w:r>
+        <w:lastRenderedPageBreak/>
         <w:t>Giới thiệu</w:t>
       </w:r>
       <w:bookmarkEnd w:id="0"/>
+      <w:bookmarkEnd w:id="1"/>
     </w:p>
     <w:p>
       <w:pPr>
         <w:pStyle w:val="Heading2"/>
         <w:jc w:val="both"/>
       </w:pPr>
-      <w:bookmarkStart w:id="1" w:name="_Toc189742663"/>
+      <w:bookmarkStart w:id="2" w:name="_Toc189742663"/>
+      <w:bookmarkStart w:id="3" w:name="_Toc190004452"/>
       <w:r>
         <w:t>Tên dự án</w:t>
       </w:r>
-      <w:bookmarkEnd w:id="1"/>
+      <w:bookmarkEnd w:id="2"/>
+      <w:bookmarkEnd w:id="3"/>
     </w:p>
     <w:p>
       <w:pPr>
@@ -2000,11 +2047,13 @@
         <w:pStyle w:val="Heading2"/>
         <w:jc w:val="both"/>
       </w:pPr>
-      <w:bookmarkStart w:id="2" w:name="_Toc189742664"/>
+      <w:bookmarkStart w:id="4" w:name="_Toc190004453"/>
+      <w:bookmarkStart w:id="5" w:name="_Toc189742664"/>
       <w:r>
         <w:t>Mô tả</w:t>
       </w:r>
-      <w:bookmarkEnd w:id="2"/>
+      <w:bookmarkEnd w:id="4"/>
+      <w:bookmarkEnd w:id="5"/>
     </w:p>
     <w:p>
       <w:pPr>
@@ -2028,11 +2077,13 @@
       <w:r>
         <w:t xml:space="preserve"> </w:t>
       </w:r>
-      <w:bookmarkStart w:id="3" w:name="_Toc189742665"/>
+      <w:bookmarkStart w:id="6" w:name="_Toc190004454"/>
+      <w:bookmarkStart w:id="7" w:name="_Toc189742665"/>
       <w:r>
         <w:t>Mục tiêu</w:t>
       </w:r>
-      <w:bookmarkEnd w:id="3"/>
+      <w:bookmarkEnd w:id="6"/>
+      <w:bookmarkEnd w:id="7"/>
     </w:p>
     <w:p>
       <w:pPr>
@@ -2050,11 +2101,13 @@
         <w:pStyle w:val="Heading2"/>
         <w:jc w:val="both"/>
       </w:pPr>
-      <w:bookmarkStart w:id="4" w:name="_Toc189742666"/>
+      <w:bookmarkStart w:id="8" w:name="_Toc190004455"/>
+      <w:bookmarkStart w:id="9" w:name="_Toc189742666"/>
       <w:r>
         <w:t>Phạm vi</w:t>
       </w:r>
-      <w:bookmarkEnd w:id="4"/>
+      <w:bookmarkEnd w:id="8"/>
+      <w:bookmarkEnd w:id="9"/>
     </w:p>
     <w:p>
       <w:pPr>
@@ -2093,69 +2146,71 @@
         <w:pStyle w:val="Heading2"/>
         <w:jc w:val="both"/>
       </w:pPr>
-      <w:bookmarkStart w:id="5" w:name="_Toc189742667"/>
+      <w:bookmarkStart w:id="10" w:name="_Toc189742667"/>
+      <w:bookmarkStart w:id="11" w:name="_Toc190004456"/>
+      <w:r>
+        <w:t>Yêu cầu chức năng</w:t>
+      </w:r>
+      <w:bookmarkEnd w:id="10"/>
+      <w:bookmarkEnd w:id="11"/>
+    </w:p>
+    <w:p>
+      <w:pPr>
+        <w:jc w:val="both"/>
+      </w:pPr>
+      <w:r>
+        <w:t xml:space="preserve"> </w:t>
+      </w:r>
+      <w:r>
+        <w:rPr>
+          <w:lang w:val="vi-VN"/>
+        </w:rPr>
+        <w:t xml:space="preserve">- </w:t>
+      </w:r>
+      <w:r>
+        <w:t>Cho phép quản lý thông tin tài khoản.</w:t>
+      </w:r>
+    </w:p>
+    <w:p>
+      <w:pPr>
+        <w:jc w:val="both"/>
+      </w:pPr>
+      <w:r>
+        <w:t xml:space="preserve"> </w:t>
+      </w:r>
+      <w:r>
+        <w:rPr>
+          <w:lang w:val="vi-VN"/>
+        </w:rPr>
+        <w:t xml:space="preserve">- </w:t>
+      </w:r>
+      <w:r>
+        <w:t>Quản lý phòng học</w:t>
+      </w:r>
+    </w:p>
+    <w:p>
+      <w:pPr>
+        <w:jc w:val="both"/>
+      </w:pPr>
+      <w:r>
+        <w:t xml:space="preserve"> </w:t>
+      </w:r>
+      <w:r>
+        <w:rPr>
+          <w:lang w:val="vi-VN"/>
+        </w:rPr>
+        <w:t xml:space="preserve">- </w:t>
+      </w:r>
+      <w:r>
+        <w:t>Quản lý tài nguyên học tập</w:t>
+      </w:r>
+    </w:p>
+    <w:p>
+      <w:pPr>
+        <w:jc w:val="both"/>
+      </w:pPr>
       <w:r>
         <w:lastRenderedPageBreak/>
-        <w:t>Yêu cầu chức năng</w:t>
-      </w:r>
-      <w:bookmarkEnd w:id="5"/>
-    </w:p>
-    <w:p>
-      <w:pPr>
-        <w:jc w:val="both"/>
-      </w:pPr>
-      <w:r>
-        <w:t xml:space="preserve"> </w:t>
-      </w:r>
-      <w:r>
-        <w:rPr>
-          <w:lang w:val="vi-VN"/>
-        </w:rPr>
-        <w:t xml:space="preserve">- </w:t>
-      </w:r>
-      <w:r>
-        <w:t>Cho phép quản lý thông tin tài khoản.</w:t>
-      </w:r>
-    </w:p>
-    <w:p>
-      <w:pPr>
-        <w:jc w:val="both"/>
-      </w:pPr>
-      <w:r>
-        <w:t xml:space="preserve"> </w:t>
-      </w:r>
-      <w:r>
-        <w:rPr>
-          <w:lang w:val="vi-VN"/>
-        </w:rPr>
-        <w:t xml:space="preserve">- </w:t>
-      </w:r>
-      <w:r>
-        <w:t>Quản lý phòng học</w:t>
-      </w:r>
-    </w:p>
-    <w:p>
-      <w:pPr>
-        <w:jc w:val="both"/>
-      </w:pPr>
-      <w:r>
-        <w:t xml:space="preserve"> </w:t>
-      </w:r>
-      <w:r>
-        <w:rPr>
-          <w:lang w:val="vi-VN"/>
-        </w:rPr>
-        <w:t xml:space="preserve">- </w:t>
-      </w:r>
-      <w:r>
-        <w:t>Quản lý tài nguyên học tập</w:t>
-      </w:r>
-    </w:p>
-    <w:p>
-      <w:pPr>
-        <w:jc w:val="both"/>
-      </w:pPr>
-      <w:r>
         <w:t xml:space="preserve"> </w:t>
       </w:r>
       <w:r>
@@ -2227,11 +2282,13 @@
         <w:pStyle w:val="Heading2"/>
         <w:jc w:val="both"/>
       </w:pPr>
-      <w:bookmarkStart w:id="6" w:name="_Toc189742668"/>
+      <w:bookmarkStart w:id="12" w:name="_Toc190004457"/>
+      <w:bookmarkStart w:id="13" w:name="_Toc189742668"/>
       <w:r>
         <w:t>Yêu cầu phi chức năng</w:t>
       </w:r>
-      <w:bookmarkEnd w:id="6"/>
+      <w:bookmarkEnd w:id="12"/>
+      <w:bookmarkEnd w:id="13"/>
     </w:p>
     <w:p>
       <w:pPr>
@@ -2278,11 +2335,13 @@
         <w:pStyle w:val="Heading2"/>
         <w:jc w:val="both"/>
       </w:pPr>
-      <w:bookmarkStart w:id="7" w:name="_Toc189742669"/>
+      <w:bookmarkStart w:id="14" w:name="_Toc189742669"/>
+      <w:bookmarkStart w:id="15" w:name="_Toc190004458"/>
       <w:r>
         <w:t>Stakeholders</w:t>
       </w:r>
-      <w:bookmarkEnd w:id="7"/>
+      <w:bookmarkEnd w:id="14"/>
+      <w:bookmarkEnd w:id="15"/>
     </w:p>
     <w:p>
       <w:pPr>
@@ -2401,7 +2460,6 @@
         </w:rPr>
       </w:pPr>
       <w:r>
-        <w:lastRenderedPageBreak/>
         <w:t>Quản trị viên (Admin)</w:t>
       </w:r>
     </w:p>
@@ -2450,6 +2508,7 @@
         </w:rPr>
       </w:pPr>
       <w:r>
+        <w:lastRenderedPageBreak/>
         <w:t>- Giải quyết các vấn đề phát sinh từ hệ thống hoặc phản hồi từ khách hàng</w:t>
       </w:r>
     </w:p>
@@ -2621,11 +2680,13 @@
       <w:pPr>
         <w:pStyle w:val="Heading1"/>
       </w:pPr>
-      <w:bookmarkStart w:id="8" w:name="_Toc189742670"/>
+      <w:bookmarkStart w:id="16" w:name="_Toc189742670"/>
+      <w:bookmarkStart w:id="17" w:name="_Toc190004459"/>
       <w:r>
         <w:t>Phân tích yêu cầu</w:t>
       </w:r>
-      <w:bookmarkEnd w:id="8"/>
+      <w:bookmarkEnd w:id="16"/>
+      <w:bookmarkEnd w:id="17"/>
       <w:r>
         <w:t xml:space="preserve"> </w:t>
       </w:r>
@@ -2635,11 +2696,13 @@
         <w:pStyle w:val="Heading2"/>
         <w:jc w:val="both"/>
       </w:pPr>
-      <w:bookmarkStart w:id="9" w:name="_Toc189742671"/>
+      <w:bookmarkStart w:id="18" w:name="_Toc190004460"/>
+      <w:bookmarkStart w:id="19" w:name="_Toc189742671"/>
       <w:r>
         <w:t>Danh sách yêu cầu từ người dùng</w:t>
       </w:r>
-      <w:bookmarkEnd w:id="9"/>
+      <w:bookmarkEnd w:id="18"/>
+      <w:bookmarkEnd w:id="19"/>
     </w:p>
     <w:p>
       <w:r>
@@ -2672,6 +2735,28 @@
       </w:r>
       <w:r>
         <w:t>Có cách nào để theo dõi và lưu trữ kết quả học tập của từng học sinh không? Tôi muốn có báo cáo chi tiết, nhưng cũng phải dễ hiểu.</w:t>
+      </w:r>
+    </w:p>
+    <w:p>
+      <w:r>
+        <w:rPr>
+          <w:lang w:val="vi-VN"/>
+        </w:rPr>
+        <w:t xml:space="preserve">+ </w:t>
+      </w:r>
+      <w:r>
+        <w:t>Mỗi người sử dụng hệ thống như giáo viên và học sinh, cần có tài khoản riêng, và tôi muốn quản lý tài khoản đó sao cho tiện lợi.</w:t>
+      </w:r>
+    </w:p>
+    <w:p>
+      <w:r>
+        <w:rPr>
+          <w:lang w:val="vi-VN"/>
+        </w:rPr>
+        <w:t xml:space="preserve">+ </w:t>
+      </w:r>
+      <w:r>
+        <w:t>Tôi muốn có một cách để phân quyền, ví dụ như ai là giáo viên thì được làm gì, còn học sinh thì bị giới hạn quyền gì đó.</w:t>
       </w:r>
     </w:p>
     <w:p>
@@ -2683,28 +2768,6 @@
         <w:t xml:space="preserve">+ </w:t>
       </w:r>
       <w:r>
-        <w:t>Mỗi người sử dụng hệ thống như giáo viên và học sinh, cần có tài khoản riêng, và tôi muốn quản lý tài khoản đó sao cho tiện lợi.</w:t>
-      </w:r>
-    </w:p>
-    <w:p>
-      <w:r>
-        <w:rPr>
-          <w:lang w:val="vi-VN"/>
-        </w:rPr>
-        <w:t xml:space="preserve">+ </w:t>
-      </w:r>
-      <w:r>
-        <w:t>Tôi muốn có một cách để phân quyền, ví dụ như ai là giáo viên thì được làm gì, còn học sinh thì bị giới hạn quyền gì đó.</w:t>
-      </w:r>
-    </w:p>
-    <w:p>
-      <w:r>
-        <w:rPr>
-          <w:lang w:val="vi-VN"/>
-        </w:rPr>
-        <w:t xml:space="preserve">+ </w:t>
-      </w:r>
-      <w:r>
         <w:t>Có thể gửi thông báo cho các lớp học không? Điều này phải tự động, chứ tôi không muốn làm thủ công.</w:t>
       </w:r>
     </w:p>
@@ -2803,22 +2866,26 @@
           <w:lang w:val="vi-VN"/>
         </w:rPr>
       </w:pPr>
-      <w:bookmarkStart w:id="10" w:name="_Toc189742672"/>
+      <w:bookmarkStart w:id="20" w:name="_Toc189742672"/>
+      <w:bookmarkStart w:id="21" w:name="_Toc190004461"/>
       <w:r>
         <w:t>Đặc tả yêu cầu</w:t>
       </w:r>
-      <w:bookmarkEnd w:id="10"/>
+      <w:bookmarkEnd w:id="20"/>
+      <w:bookmarkEnd w:id="21"/>
     </w:p>
     <w:p>
       <w:pPr>
         <w:pStyle w:val="Heading3"/>
         <w:jc w:val="both"/>
       </w:pPr>
-      <w:bookmarkStart w:id="11" w:name="_Toc189742673"/>
+      <w:bookmarkStart w:id="22" w:name="_Toc190004462"/>
+      <w:bookmarkStart w:id="23" w:name="_Toc189742673"/>
       <w:r>
         <w:t>Tôi muốn một chỗ để tạo các phòng học cho nhóm học viên.</w:t>
       </w:r>
-      <w:bookmarkEnd w:id="11"/>
+      <w:bookmarkEnd w:id="22"/>
+      <w:bookmarkEnd w:id="23"/>
     </w:p>
     <w:p>
       <w:pPr>
@@ -2901,7 +2968,6 @@
         <w:jc w:val="both"/>
       </w:pPr>
       <w:r>
-        <w:lastRenderedPageBreak/>
         <w:t>Học viên có thể tham gia phòng học ảo bằng cách nhập mã phòng học được giảng viên cung cấp. Ngoài ra học viên có thể tham gia phòng học khi nhận được lời mời của giảng viên được gửi thông qua Email.</w:t>
       </w:r>
     </w:p>
@@ -2942,6 +3008,7 @@
         <w:jc w:val="both"/>
       </w:pPr>
       <w:r>
+        <w:lastRenderedPageBreak/>
         <w:t>Sửa thông tin phòng học ảo: Giảng viên có thể tiến hành chọn và sửa đổi thông tin phòng học ảo do giảng viên tạo.</w:t>
       </w:r>
     </w:p>
@@ -2988,11 +3055,13 @@
         <w:pStyle w:val="Heading3"/>
         <w:jc w:val="both"/>
       </w:pPr>
-      <w:bookmarkStart w:id="12" w:name="_Toc189742674"/>
+      <w:bookmarkStart w:id="24" w:name="_Toc189742674"/>
+      <w:bookmarkStart w:id="25" w:name="_Toc190004463"/>
       <w:r>
         <w:t>Làm sao để chúng tôi có thể quản lý và cập nhật tài nguyên học tập dễ dàng, thậm chí có thể tải lên nhiều loại tài nguyên khác nhau?</w:t>
       </w:r>
-      <w:bookmarkEnd w:id="12"/>
+      <w:bookmarkEnd w:id="24"/>
+      <w:bookmarkEnd w:id="25"/>
     </w:p>
     <w:p>
       <w:pPr>
@@ -3133,7 +3202,6 @@
         <w:jc w:val="both"/>
       </w:pPr>
       <w:r>
-        <w:lastRenderedPageBreak/>
         <w:t>Xem tài nguyên học tập: Xem thông tin tài nguyên học tập trong phòng học tham gia bất kỳ.</w:t>
       </w:r>
     </w:p>
@@ -3164,11 +3232,14 @@
         <w:pStyle w:val="Heading3"/>
         <w:jc w:val="both"/>
       </w:pPr>
-      <w:bookmarkStart w:id="13" w:name="_Toc189742675"/>
-      <w:r>
+      <w:bookmarkStart w:id="26" w:name="_Toc190004464"/>
+      <w:bookmarkStart w:id="27" w:name="_Toc189742675"/>
+      <w:r>
+        <w:lastRenderedPageBreak/>
         <w:t>Có cách nào để theo dõi và lưu trữ kết quả học tập của từng học sinh không? Tôi muốn có báo cáo chi tiết, nhưng cũng phải dễ hiểu.</w:t>
       </w:r>
-      <w:bookmarkEnd w:id="13"/>
+      <w:bookmarkEnd w:id="26"/>
+      <w:bookmarkEnd w:id="27"/>
     </w:p>
     <w:p>
       <w:pPr>
@@ -3361,12 +3432,13 @@
         <w:pStyle w:val="Heading3"/>
         <w:jc w:val="both"/>
       </w:pPr>
-      <w:bookmarkStart w:id="14" w:name="_Toc189742676"/>
-      <w:r>
-        <w:lastRenderedPageBreak/>
+      <w:bookmarkStart w:id="28" w:name="_Toc189742676"/>
+      <w:bookmarkStart w:id="29" w:name="_Toc190004465"/>
+      <w:r>
         <w:t>Mỗi người sử dụng hệ thống, như giáo viên và học sinh, cần có tài khoản riêng, và tôi muốn quản lý tài khoản đó sao cho tiện lợi.</w:t>
       </w:r>
-      <w:bookmarkEnd w:id="14"/>
+      <w:bookmarkEnd w:id="28"/>
+      <w:bookmarkEnd w:id="29"/>
     </w:p>
     <w:p>
       <w:pPr>
@@ -3405,6 +3477,7 @@
         <w:jc w:val="both"/>
       </w:pPr>
       <w:r>
+        <w:lastRenderedPageBreak/>
         <w:t>Tạo tài khoản cá nhân.</w:t>
       </w:r>
     </w:p>
@@ -3537,11 +3610,13 @@
         <w:pStyle w:val="Heading3"/>
         <w:jc w:val="both"/>
       </w:pPr>
-      <w:bookmarkStart w:id="15" w:name="_Toc189742677"/>
+      <w:bookmarkStart w:id="30" w:name="_Toc189742677"/>
+      <w:bookmarkStart w:id="31" w:name="_Toc190004466"/>
       <w:r>
         <w:t>Tôi muốn có một cách để phân quyền, ví dụ như ai là giáo viên thì được làm gì, còn học sinh thì bị giới hạn quyền gì đó.</w:t>
       </w:r>
-      <w:bookmarkEnd w:id="15"/>
+      <w:bookmarkEnd w:id="30"/>
+      <w:bookmarkEnd w:id="31"/>
     </w:p>
     <w:p>
       <w:pPr>
@@ -3579,26 +3654,23 @@
         <w:jc w:val="both"/>
       </w:pPr>
       <w:r>
-        <w:t xml:space="preserve">Hệ thống cấp quyền chủ phòng cho tài khoản tạo phòng, tài khoản có mọi quyền hạn trong phòng như thêm, xóa tài khoản khác ra khỏi phòng, quản lý tài </w:t>
-      </w:r>
+        <w:t>Hệ thống cấp quyền chủ phòng cho tài khoản tạo phòng, tài khoản có mọi quyền hạn trong phòng như thêm, xóa tài khoản khác ra khỏi phòng, quản lý tài nguyên học tập trong phòng, cấp quyền cho các tài khoản thuộc phòng đó và 1 số tính năng nhỏ khác.</w:t>
+      </w:r>
+    </w:p>
+    <w:p>
+      <w:pPr>
+        <w:jc w:val="both"/>
+      </w:pPr>
+      <w:r>
+        <w:t>Tài khoản được cấp quyền giảng viên được phép quản lý tài nguyên học tập và kết quả học tập trong phòng.</w:t>
+      </w:r>
+    </w:p>
+    <w:p>
+      <w:pPr>
+        <w:jc w:val="both"/>
+      </w:pPr>
       <w:r>
         <w:lastRenderedPageBreak/>
-        <w:t>nguyên học tập trong phòng, cấp quyền cho các tài khoản thuộc phòng đó và 1 số tính năng nhỏ khác.</w:t>
-      </w:r>
-    </w:p>
-    <w:p>
-      <w:pPr>
-        <w:jc w:val="both"/>
-      </w:pPr>
-      <w:r>
-        <w:t>Tài khoản được cấp quyền giảng viên được phép quản lý tài nguyên học tập và kết quả học tập trong phòng.</w:t>
-      </w:r>
-    </w:p>
-    <w:p>
-      <w:pPr>
-        <w:jc w:val="both"/>
-      </w:pPr>
-      <w:r>
         <w:t>Tài khoản học viên chỉ được xem kết quả học tập và tương tác với các tài nguyên học tập được đăng.</w:t>
       </w:r>
     </w:p>
@@ -3702,11 +3774,13 @@
         <w:pStyle w:val="Heading3"/>
         <w:jc w:val="both"/>
       </w:pPr>
-      <w:bookmarkStart w:id="16" w:name="_Toc189742678"/>
+      <w:bookmarkStart w:id="32" w:name="_Toc189742678"/>
+      <w:bookmarkStart w:id="33" w:name="_Toc190004467"/>
       <w:r>
         <w:t>Gửi thông báo tài nguyên học tập được đăng cho các tài khoản trong phòng học. Điều này phải tự động, chứ tôi không muốn làm thủ công.</w:t>
       </w:r>
-      <w:bookmarkEnd w:id="16"/>
+      <w:bookmarkEnd w:id="32"/>
+      <w:bookmarkEnd w:id="33"/>
     </w:p>
     <w:p>
       <w:pPr>
@@ -3808,7 +3882,6 @@
         <w:jc w:val="both"/>
       </w:pPr>
       <w:r>
-        <w:lastRenderedPageBreak/>
         <w:t>Bảng tin của phòng học cũng sẽ hiển thị tóm tắt nội dung được đăng cho phép người dùng tham gia lớp học xem.</w:t>
       </w:r>
     </w:p>
@@ -3831,6 +3904,7 @@
           <w:bCs/>
           <w:lang w:val="vi-VN"/>
         </w:rPr>
+        <w:lastRenderedPageBreak/>
         <w:t xml:space="preserve">          </w:t>
       </w:r>
       <w:r>
@@ -3924,11 +3998,13 @@
         <w:pStyle w:val="Heading3"/>
         <w:jc w:val="both"/>
       </w:pPr>
-      <w:bookmarkStart w:id="17" w:name="_Toc189742679"/>
+      <w:bookmarkStart w:id="34" w:name="_Toc189742679"/>
+      <w:bookmarkStart w:id="35" w:name="_Toc190004468"/>
       <w:r>
         <w:t>Làm thế nào để đảm bảo học viên chỉ truy cập vào đúng tài nguyên của lớp học mình?</w:t>
       </w:r>
-      <w:bookmarkEnd w:id="17"/>
+      <w:bookmarkEnd w:id="34"/>
+      <w:bookmarkEnd w:id="35"/>
     </w:p>
     <w:p>
       <w:pPr>
@@ -4050,12 +4126,13 @@
         <w:pStyle w:val="Heading3"/>
         <w:jc w:val="both"/>
       </w:pPr>
-      <w:bookmarkStart w:id="18" w:name="_Toc189742680"/>
-      <w:r>
-        <w:lastRenderedPageBreak/>
+      <w:bookmarkStart w:id="36" w:name="_Toc190004469"/>
+      <w:bookmarkStart w:id="37" w:name="_Toc189742680"/>
+      <w:r>
         <w:t>Hệ thống phải nhanh, tôi không muốn chờ quá lâu khi mở hoặc tải dữ liệu.</w:t>
       </w:r>
-      <w:bookmarkEnd w:id="18"/>
+      <w:bookmarkEnd w:id="36"/>
+      <w:bookmarkEnd w:id="37"/>
     </w:p>
     <w:p>
       <w:pPr>
@@ -4085,6 +4162,7 @@
         <w:jc w:val="both"/>
       </w:pPr>
       <w:r>
+        <w:lastRenderedPageBreak/>
         <w:t>Đảm bảo phản hồi của hệ thống đối với sự tương tác của người dùng với tài nguyên học tập nhanh nhất có thể.</w:t>
       </w:r>
     </w:p>
@@ -4171,11 +4249,13 @@
         <w:pStyle w:val="Heading3"/>
         <w:jc w:val="both"/>
       </w:pPr>
-      <w:bookmarkStart w:id="19" w:name="_Toc189742681"/>
+      <w:bookmarkStart w:id="38" w:name="_Toc189742681"/>
+      <w:bookmarkStart w:id="39" w:name="_Toc190004470"/>
       <w:r>
         <w:t>Dữ liệu của học sinh và giáo viên được bảo mật</w:t>
       </w:r>
-      <w:bookmarkEnd w:id="19"/>
+      <w:bookmarkEnd w:id="38"/>
+      <w:bookmarkEnd w:id="39"/>
     </w:p>
     <w:p>
       <w:pPr>
@@ -4298,12 +4378,13 @@
         <w:pStyle w:val="Heading3"/>
         <w:jc w:val="both"/>
       </w:pPr>
-      <w:bookmarkStart w:id="20" w:name="_Toc189742682"/>
-      <w:r>
-        <w:lastRenderedPageBreak/>
+      <w:bookmarkStart w:id="40" w:name="_Toc189742682"/>
+      <w:bookmarkStart w:id="41" w:name="_Toc190004471"/>
+      <w:r>
         <w:t>Giao diện dễ sử dụng</w:t>
       </w:r>
-      <w:bookmarkEnd w:id="20"/>
+      <w:bookmarkEnd w:id="40"/>
+      <w:bookmarkEnd w:id="41"/>
     </w:p>
     <w:p>
       <w:pPr>
@@ -4333,6 +4414,7 @@
         <w:jc w:val="both"/>
       </w:pPr>
       <w:r>
+        <w:lastRenderedPageBreak/>
         <w:t>Giao diện phải thân thiện và trực quan để người dùng phổ thông vẫn sử dụng được.</w:t>
       </w:r>
     </w:p>
@@ -4428,11 +4510,13 @@
       <w:r>
         <w:t> </w:t>
       </w:r>
-      <w:bookmarkStart w:id="21" w:name="_Toc189742683"/>
+      <w:bookmarkStart w:id="42" w:name="_Toc189742683"/>
+      <w:bookmarkStart w:id="43" w:name="_Toc190004472"/>
       <w:r>
         <w:t>Hệ thống chạy ổn định khi nhiều người sử dụng</w:t>
       </w:r>
-      <w:bookmarkEnd w:id="21"/>
+      <w:bookmarkEnd w:id="42"/>
+      <w:bookmarkEnd w:id="43"/>
     </w:p>
     <w:p>
       <w:pPr>
@@ -4526,11 +4610,13 @@
         <w:pStyle w:val="Heading3"/>
         <w:jc w:val="both"/>
       </w:pPr>
-      <w:bookmarkStart w:id="22" w:name="_Toc189742684"/>
+      <w:bookmarkStart w:id="44" w:name="_Toc190004473"/>
+      <w:bookmarkStart w:id="45" w:name="_Toc189742684"/>
       <w:r>
         <w:t>Cài đặt dễ dàng</w:t>
       </w:r>
-      <w:bookmarkEnd w:id="22"/>
+      <w:bookmarkEnd w:id="44"/>
+      <w:bookmarkEnd w:id="45"/>
     </w:p>
     <w:p>
       <w:pPr>
@@ -4595,18 +4681,18 @@
         <w:jc w:val="both"/>
       </w:pPr>
       <w:r>
+        <w:t>Trình cài đặt tự động, dễ sử dụng.</w:t>
+      </w:r>
+    </w:p>
+    <w:p>
+      <w:pPr>
+        <w:jc w:val="both"/>
+        <w:rPr>
+          <w:lang w:val="vi-VN"/>
+        </w:rPr>
+      </w:pPr>
+      <w:r>
         <w:lastRenderedPageBreak/>
-        <w:t>Trình cài đặt tự động, dễ sử dụng.</w:t>
-      </w:r>
-    </w:p>
-    <w:p>
-      <w:pPr>
-        <w:jc w:val="both"/>
-        <w:rPr>
-          <w:lang w:val="vi-VN"/>
-        </w:rPr>
-      </w:pPr>
-      <w:r>
         <w:t>Không yêu cầu cấu hình phức tạp.</w:t>
       </w:r>
       <w:r>
@@ -4627,11 +4713,13 @@
         <w:pStyle w:val="Heading3"/>
         <w:jc w:val="both"/>
       </w:pPr>
-      <w:bookmarkStart w:id="23" w:name="_Toc189742685"/>
+      <w:bookmarkStart w:id="46" w:name="_Toc189742685"/>
+      <w:bookmarkStart w:id="47" w:name="_Toc190004474"/>
       <w:r>
         <w:t>Tốc độ chuyển tab không bị delay, đảm bảo sự mượt mà khi chuyển qua giao diện khác.</w:t>
       </w:r>
-      <w:bookmarkEnd w:id="23"/>
+      <w:bookmarkEnd w:id="46"/>
+      <w:bookmarkEnd w:id="47"/>
     </w:p>
     <w:p>
       <w:pPr>
@@ -4710,11 +4798,13 @@
         <w:pStyle w:val="Heading2"/>
         <w:jc w:val="both"/>
       </w:pPr>
-      <w:bookmarkStart w:id="24" w:name="_Toc189742686"/>
+      <w:bookmarkStart w:id="48" w:name="_Toc190004475"/>
+      <w:bookmarkStart w:id="49" w:name="_Toc189742686"/>
       <w:r>
         <w:t>MODULE</w:t>
       </w:r>
-      <w:bookmarkEnd w:id="24"/>
+      <w:bookmarkEnd w:id="48"/>
+      <w:bookmarkEnd w:id="49"/>
     </w:p>
     <w:p>
       <w:pPr>
@@ -4864,7 +4954,8 @@
           <w:lang w:val="vi-VN"/>
         </w:rPr>
       </w:pPr>
-      <w:bookmarkStart w:id="25" w:name="_Toc189742687"/>
+      <w:bookmarkStart w:id="50" w:name="_Toc189742687"/>
+      <w:bookmarkStart w:id="51" w:name="_Toc190004476"/>
       <w:r>
         <w:rPr>
           <w:lang w:val="vi-VN"/>
@@ -4872,7 +4963,8 @@
         <w:lastRenderedPageBreak/>
         <w:t>THIẾT KẾ DỮ LIỆU</w:t>
       </w:r>
-      <w:bookmarkEnd w:id="25"/>
+      <w:bookmarkEnd w:id="50"/>
+      <w:bookmarkEnd w:id="51"/>
     </w:p>
     <w:p>
       <w:pPr>
@@ -4881,14 +4973,16 @@
           <w:lang w:val="vi-VN"/>
         </w:rPr>
       </w:pPr>
-      <w:bookmarkStart w:id="26" w:name="_Toc189742688"/>
+      <w:bookmarkStart w:id="52" w:name="_Toc189742688"/>
+      <w:bookmarkStart w:id="53" w:name="_Toc190004477"/>
       <w:r>
         <w:rPr>
           <w:lang w:val="vi-VN"/>
         </w:rPr>
         <w:t>ERD( Entity-Relationship Diagram) – Sơ đồ thực thể quan hệ</w:t>
       </w:r>
-      <w:bookmarkEnd w:id="26"/>
+      <w:bookmarkEnd w:id="52"/>
+      <w:bookmarkEnd w:id="53"/>
     </w:p>
     <w:p>
       <w:pPr>
@@ -4917,7 +5011,7 @@
           <w:lang w:val="vi-VN"/>
         </w:rPr>
         <w:drawing>
-          <wp:inline distT="0" distB="0" distL="0" distR="0" wp14:anchorId="3E6E2B20" wp14:editId="23793EC6">
+          <wp:inline distT="0" distB="0" distL="0" distR="0" wp14:anchorId="6D89131B" wp14:editId="3EAEE693">
             <wp:extent cx="5943600" cy="3096895"/>
             <wp:effectExtent l="0" t="0" r="0" b="8255"/>
             <wp:docPr id="890724576" name="Picture 1" descr="A diagram of a company&#10;&#10;Description automatically generated"/>
@@ -4934,7 +5028,7 @@
                     </pic:cNvPicPr>
                   </pic:nvPicPr>
                   <pic:blipFill>
-                    <a:blip r:embed="rId8"/>
+                    <a:blip r:embed="rId10"/>
                     <a:stretch>
                       <a:fillRect/>
                     </a:stretch>
@@ -4967,11 +5061,13 @@
       <w:pPr>
         <w:pStyle w:val="Heading2"/>
       </w:pPr>
-      <w:bookmarkStart w:id="27" w:name="_Toc189742689"/>
+      <w:bookmarkStart w:id="54" w:name="_Toc189742689"/>
+      <w:bookmarkStart w:id="55" w:name="_Toc190004478"/>
       <w:r>
         <w:t>Bảng quan hệ dữ liệu</w:t>
       </w:r>
-      <w:bookmarkEnd w:id="27"/>
+      <w:bookmarkEnd w:id="54"/>
+      <w:bookmarkEnd w:id="55"/>
     </w:p>
     <w:p>
       <w:pPr>
@@ -13925,13 +14021,141 @@
     </w:p>
     <w:p>
       <w:pPr>
-        <w:rPr>
-          <w:rFonts w:eastAsia="Calibri"/>
-          <w:sz w:val="18"/>
-          <w:szCs w:val="18"/>
+        <w:pStyle w:val="Heading2"/>
+        <w:rPr>
           <w:lang w:val="vi-VN"/>
         </w:rPr>
       </w:pPr>
+      <w:bookmarkStart w:id="56" w:name="_Toc190004479"/>
+      <w:r>
+        <w:rPr>
+          <w:lang w:val="vi-VN"/>
+        </w:rPr>
+        <w:t>Sơ đồ usecase</w:t>
+      </w:r>
+      <w:bookmarkEnd w:id="56"/>
+    </w:p>
+    <w:p>
+      <w:pPr>
+        <w:rPr>
+          <w:lang w:val="vi-VN"/>
+        </w:rPr>
+      </w:pPr>
+      <w:r>
+        <w:rPr>
+          <w:noProof/>
+          <w:lang w:val="vi-VN"/>
+        </w:rPr>
+        <w:drawing>
+          <wp:inline distT="0" distB="0" distL="0" distR="0" wp14:anchorId="56D0614E" wp14:editId="1331C741">
+            <wp:extent cx="5943600" cy="4153535"/>
+            <wp:effectExtent l="0" t="0" r="0" b="0"/>
+            <wp:docPr id="668309615" name="Picture 1" descr="A diagram of a diagram&#10;&#10;AI-generated content may be incorrect."/>
+            <wp:cNvGraphicFramePr>
+              <a:graphicFrameLocks xmlns:a="http://schemas.openxmlformats.org/drawingml/2006/main" noChangeAspect="1"/>
+            </wp:cNvGraphicFramePr>
+            <a:graphic xmlns:a="http://schemas.openxmlformats.org/drawingml/2006/main">
+              <a:graphicData uri="http://schemas.openxmlformats.org/drawingml/2006/picture">
+                <pic:pic xmlns:pic="http://schemas.openxmlformats.org/drawingml/2006/picture">
+                  <pic:nvPicPr>
+                    <pic:cNvPr id="668309615" name="Picture 1" descr="A diagram of a diagram&#10;&#10;AI-generated content may be incorrect."/>
+                    <pic:cNvPicPr>
+                      <a:picLocks noChangeAspect="1"/>
+                    </pic:cNvPicPr>
+                  </pic:nvPicPr>
+                  <pic:blipFill>
+                    <a:blip r:embed="rId11"/>
+                    <a:stretch>
+                      <a:fillRect/>
+                    </a:stretch>
+                  </pic:blipFill>
+                  <pic:spPr>
+                    <a:xfrm>
+                      <a:off x="0" y="0"/>
+                      <a:ext cx="5943600" cy="4153535"/>
+                    </a:xfrm>
+                    <a:prstGeom prst="rect">
+                      <a:avLst/>
+                    </a:prstGeom>
+                  </pic:spPr>
+                </pic:pic>
+              </a:graphicData>
+            </a:graphic>
+          </wp:inline>
+        </w:drawing>
+      </w:r>
+    </w:p>
+    <w:p>
+      <w:pPr>
+        <w:rPr>
+          <w:lang w:val="vi-VN"/>
+        </w:rPr>
+      </w:pPr>
+    </w:p>
+    <w:p>
+      <w:pPr>
+        <w:rPr>
+          <w:lang w:val="vi-VN"/>
+        </w:rPr>
+      </w:pPr>
+    </w:p>
+    <w:p>
+      <w:pPr>
+        <w:rPr>
+          <w:lang w:val="vi-VN"/>
+        </w:rPr>
+      </w:pPr>
+      <w:r>
+        <w:rPr>
+          <w:noProof/>
+          <w:lang w:val="vi-VN"/>
+        </w:rPr>
+        <w:lastRenderedPageBreak/>
+        <w:drawing>
+          <wp:inline distT="0" distB="0" distL="0" distR="0" wp14:anchorId="77B5BAE3" wp14:editId="11CF921A">
+            <wp:extent cx="5943600" cy="5533390"/>
+            <wp:effectExtent l="0" t="0" r="0" b="0"/>
+            <wp:docPr id="1781292041" name="Picture 1" descr="A diagram of a diagram&#10;&#10;AI-generated content may be incorrect."/>
+            <wp:cNvGraphicFramePr>
+              <a:graphicFrameLocks xmlns:a="http://schemas.openxmlformats.org/drawingml/2006/main" noChangeAspect="1"/>
+            </wp:cNvGraphicFramePr>
+            <a:graphic xmlns:a="http://schemas.openxmlformats.org/drawingml/2006/main">
+              <a:graphicData uri="http://schemas.openxmlformats.org/drawingml/2006/picture">
+                <pic:pic xmlns:pic="http://schemas.openxmlformats.org/drawingml/2006/picture">
+                  <pic:nvPicPr>
+                    <pic:cNvPr id="1781292041" name="Picture 1" descr="A diagram of a diagram&#10;&#10;AI-generated content may be incorrect."/>
+                    <pic:cNvPicPr>
+                      <a:picLocks noChangeAspect="1"/>
+                    </pic:cNvPicPr>
+                  </pic:nvPicPr>
+                  <pic:blipFill>
+                    <a:blip r:embed="rId12"/>
+                    <a:stretch>
+                      <a:fillRect/>
+                    </a:stretch>
+                  </pic:blipFill>
+                  <pic:spPr>
+                    <a:xfrm>
+                      <a:off x="0" y="0"/>
+                      <a:ext cx="5943600" cy="5533390"/>
+                    </a:xfrm>
+                    <a:prstGeom prst="rect">
+                      <a:avLst/>
+                    </a:prstGeom>
+                  </pic:spPr>
+                </pic:pic>
+              </a:graphicData>
+            </a:graphic>
+          </wp:inline>
+        </w:drawing>
+      </w:r>
+    </w:p>
+    <w:p>
+      <w:pPr>
+        <w:rPr>
+          <w:lang w:val="vi-VN"/>
+        </w:rPr>
+      </w:pPr>
     </w:p>
     <w:p>
       <w:pPr>
@@ -13940,14 +14164,14 @@
           <w:lang w:val="vi-VN"/>
         </w:rPr>
       </w:pPr>
-      <w:bookmarkStart w:id="28" w:name="_Toc189742690"/>
+      <w:bookmarkStart w:id="57" w:name="_Toc190004480"/>
       <w:r>
         <w:rPr>
           <w:lang w:val="vi-VN"/>
         </w:rPr>
-        <w:t>BẢNG DANH SÁCH CHỨC NĂNG</w:t>
-      </w:r>
-      <w:bookmarkEnd w:id="28"/>
+        <w:t>Bảng danh sách chức năng</w:t>
+      </w:r>
+      <w:bookmarkEnd w:id="57"/>
     </w:p>
     <w:p>
       <w:pPr>
@@ -25353,141 +25577,6 @@
           </w:p>
         </w:tc>
       </w:tr>
-      <w:tr>
-        <w:tc>
-          <w:tcPr>
-            <w:tcW w:w="1258" w:type="dxa"/>
-            <w:tcBorders>
-              <w:top w:val="single" w:sz="4" w:space="0" w:color="auto"/>
-              <w:left w:val="single" w:sz="4" w:space="0" w:color="auto"/>
-              <w:bottom w:val="single" w:sz="4" w:space="0" w:color="auto"/>
-              <w:right w:val="single" w:sz="4" w:space="0" w:color="auto"/>
-            </w:tcBorders>
-            <w:vAlign w:val="center"/>
-          </w:tcPr>
-          <w:p>
-            <w:pPr>
-              <w:numPr>
-                <w:ilvl w:val="0"/>
-                <w:numId w:val="3"/>
-              </w:numPr>
-              <w:jc w:val="center"/>
-              <w:rPr>
-                <w:rFonts w:eastAsia="Calibri" w:cs="Times New Roman"/>
-                <w:sz w:val="18"/>
-                <w:szCs w:val="18"/>
-              </w:rPr>
-            </w:pPr>
-          </w:p>
-        </w:tc>
-        <w:tc>
-          <w:tcPr>
-            <w:tcW w:w="2108" w:type="dxa"/>
-            <w:tcBorders>
-              <w:top w:val="single" w:sz="4" w:space="0" w:color="auto"/>
-              <w:left w:val="single" w:sz="4" w:space="0" w:color="auto"/>
-              <w:bottom w:val="single" w:sz="4" w:space="0" w:color="auto"/>
-              <w:right w:val="single" w:sz="4" w:space="0" w:color="auto"/>
-            </w:tcBorders>
-            <w:vAlign w:val="center"/>
-          </w:tcPr>
-          <w:p>
-            <w:pPr>
-              <w:jc w:val="center"/>
-              <w:rPr>
-                <w:rFonts w:eastAsia="Calibri" w:cs="Times New Roman"/>
-                <w:sz w:val="18"/>
-                <w:szCs w:val="18"/>
-              </w:rPr>
-            </w:pPr>
-            <w:r>
-              <w:rPr>
-                <w:rFonts w:eastAsia="Calibri" w:cs="Times New Roman"/>
-                <w:sz w:val="18"/>
-                <w:szCs w:val="18"/>
-              </w:rPr>
-              <w:t>GMAIL</w:t>
-            </w:r>
-          </w:p>
-        </w:tc>
-        <w:tc>
-          <w:tcPr>
-            <w:tcW w:w="2072" w:type="dxa"/>
-            <w:tcBorders>
-              <w:top w:val="single" w:sz="4" w:space="0" w:color="auto"/>
-              <w:left w:val="single" w:sz="4" w:space="0" w:color="auto"/>
-              <w:bottom w:val="single" w:sz="4" w:space="0" w:color="auto"/>
-              <w:right w:val="single" w:sz="4" w:space="0" w:color="auto"/>
-            </w:tcBorders>
-            <w:vAlign w:val="center"/>
-          </w:tcPr>
-          <w:p>
-            <w:pPr>
-              <w:ind w:firstLine="0"/>
-              <w:jc w:val="center"/>
-              <w:rPr>
-                <w:rFonts w:eastAsia="Calibri" w:cs="Times New Roman"/>
-                <w:sz w:val="18"/>
-                <w:szCs w:val="18"/>
-              </w:rPr>
-            </w:pPr>
-            <w:r>
-              <w:rPr>
-                <w:rFonts w:eastAsia="Calibri" w:cs="Times New Roman"/>
-                <w:sz w:val="18"/>
-                <w:szCs w:val="18"/>
-              </w:rPr>
-              <w:t>Gửi email cho người dùng</w:t>
-            </w:r>
-          </w:p>
-        </w:tc>
-        <w:tc>
-          <w:tcPr>
-            <w:tcW w:w="2086" w:type="dxa"/>
-            <w:tcBorders>
-              <w:top w:val="single" w:sz="4" w:space="0" w:color="auto"/>
-              <w:left w:val="single" w:sz="4" w:space="0" w:color="auto"/>
-              <w:bottom w:val="single" w:sz="4" w:space="0" w:color="auto"/>
-              <w:right w:val="single" w:sz="4" w:space="0" w:color="auto"/>
-            </w:tcBorders>
-            <w:vAlign w:val="center"/>
-          </w:tcPr>
-          <w:p>
-            <w:pPr>
-              <w:ind w:firstLine="0"/>
-              <w:jc w:val="center"/>
-              <w:rPr>
-                <w:rFonts w:eastAsia="Calibri" w:cs="Times New Roman"/>
-                <w:sz w:val="18"/>
-                <w:szCs w:val="18"/>
-                <w:lang w:val="vi-VN"/>
-              </w:rPr>
-            </w:pPr>
-          </w:p>
-        </w:tc>
-        <w:tc>
-          <w:tcPr>
-            <w:tcW w:w="1826" w:type="dxa"/>
-            <w:tcBorders>
-              <w:top w:val="single" w:sz="4" w:space="0" w:color="auto"/>
-              <w:left w:val="single" w:sz="4" w:space="0" w:color="auto"/>
-              <w:bottom w:val="single" w:sz="4" w:space="0" w:color="auto"/>
-              <w:right w:val="single" w:sz="4" w:space="0" w:color="auto"/>
-            </w:tcBorders>
-            <w:vAlign w:val="center"/>
-          </w:tcPr>
-          <w:p>
-            <w:pPr>
-              <w:jc w:val="center"/>
-              <w:rPr>
-                <w:rFonts w:eastAsia="Calibri" w:cs="Times New Roman"/>
-                <w:sz w:val="18"/>
-                <w:szCs w:val="18"/>
-              </w:rPr>
-            </w:pPr>
-          </w:p>
-        </w:tc>
-      </w:tr>
     </w:tbl>
     <w:p>
       <w:pPr>
@@ -25586,7 +25675,8 @@
           <w:lang w:val="vi-VN"/>
         </w:rPr>
       </w:pPr>
-      <w:bookmarkStart w:id="29" w:name="_Toc189742691"/>
+      <w:bookmarkStart w:id="58" w:name="_Toc189742691"/>
+      <w:bookmarkStart w:id="59" w:name="_Toc190004481"/>
       <w:r>
         <w:rPr>
           <w:lang w:val="vi-VN"/>
@@ -25594,7 +25684,8 @@
         <w:lastRenderedPageBreak/>
         <w:t>Dfd(data flow diagram) – sơ đồ luồng dữ liệu</w:t>
       </w:r>
-      <w:bookmarkEnd w:id="29"/>
+      <w:bookmarkEnd w:id="58"/>
+      <w:bookmarkEnd w:id="59"/>
     </w:p>
     <w:p>
       <w:pPr>
@@ -25603,14 +25694,23 @@
           <w:lang w:val="vi-VN"/>
         </w:rPr>
       </w:pPr>
-      <w:bookmarkStart w:id="30" w:name="_Toc189742692"/>
+      <w:bookmarkStart w:id="60" w:name="_Toc190004482"/>
+      <w:bookmarkStart w:id="61" w:name="_Toc189742692"/>
       <w:r>
         <w:rPr>
           <w:lang w:val="vi-VN"/>
         </w:rPr>
         <w:t>Dfd mức 0</w:t>
       </w:r>
-      <w:bookmarkEnd w:id="30"/>
+      <w:bookmarkEnd w:id="60"/>
+      <w:bookmarkEnd w:id="61"/>
+    </w:p>
+    <w:p>
+      <w:pPr>
+        <w:rPr>
+          <w:lang w:val="vi-VN"/>
+        </w:rPr>
+      </w:pPr>
     </w:p>
     <w:p>
       <w:pPr>
@@ -25624,10 +25724,10 @@
           <w:lang w:val="vi-VN"/>
         </w:rPr>
         <w:drawing>
-          <wp:inline distT="0" distB="0" distL="0" distR="0" wp14:anchorId="7D69E4BA" wp14:editId="6278B99E">
-            <wp:extent cx="5943600" cy="4828540"/>
-            <wp:effectExtent l="0" t="0" r="0" b="0"/>
-            <wp:docPr id="1322259774" name="Picture 1" descr="A diagram of a flowchart&#10;&#10;Description automatically generated"/>
+          <wp:inline distT="0" distB="0" distL="0" distR="0" wp14:anchorId="632497D4" wp14:editId="0DE19C8D">
+            <wp:extent cx="5943600" cy="6245225"/>
+            <wp:effectExtent l="0" t="0" r="0" b="3175"/>
+            <wp:docPr id="429446023" name="Picture 1" descr="A diagram of a diagram&#10;&#10;AI-generated content may be incorrect."/>
             <wp:cNvGraphicFramePr>
               <a:graphicFrameLocks xmlns:a="http://schemas.openxmlformats.org/drawingml/2006/main" noChangeAspect="1"/>
             </wp:cNvGraphicFramePr>
@@ -25635,13 +25735,13 @@
               <a:graphicData uri="http://schemas.openxmlformats.org/drawingml/2006/picture">
                 <pic:pic xmlns:pic="http://schemas.openxmlformats.org/drawingml/2006/picture">
                   <pic:nvPicPr>
-                    <pic:cNvPr id="1322259774" name="Picture 1" descr="A diagram of a flowchart&#10;&#10;Description automatically generated"/>
+                    <pic:cNvPr id="429446023" name="Picture 1" descr="A diagram of a diagram&#10;&#10;AI-generated content may be incorrect."/>
                     <pic:cNvPicPr>
                       <a:picLocks noChangeAspect="1"/>
                     </pic:cNvPicPr>
                   </pic:nvPicPr>
                   <pic:blipFill>
-                    <a:blip r:embed="rId9"/>
+                    <a:blip r:embed="rId13"/>
                     <a:stretch>
                       <a:fillRect/>
                     </a:stretch>
@@ -25649,7 +25749,7 @@
                   <pic:spPr>
                     <a:xfrm>
                       <a:off x="0" y="0"/>
-                      <a:ext cx="5943600" cy="4828540"/>
+                      <a:ext cx="5943600" cy="6245225"/>
                     </a:xfrm>
                     <a:prstGeom prst="rect">
                       <a:avLst/>
@@ -25668,49 +25768,13 @@
           <w:lang w:val="vi-VN"/>
         </w:rPr>
       </w:pPr>
-      <w:r>
-        <w:rPr>
-          <w:noProof/>
+    </w:p>
+    <w:p>
+      <w:pPr>
+        <w:rPr>
           <w:lang w:val="vi-VN"/>
         </w:rPr>
-        <w:drawing>
-          <wp:inline distT="0" distB="0" distL="0" distR="0" wp14:anchorId="4C75BA97" wp14:editId="5B8404AD">
-            <wp:extent cx="5943600" cy="1608455"/>
-            <wp:effectExtent l="0" t="0" r="0" b="0"/>
-            <wp:docPr id="845544252" name="Picture 1" descr="A diagram with arrows and a rectangle&#10;&#10;Description automatically generated"/>
-            <wp:cNvGraphicFramePr>
-              <a:graphicFrameLocks xmlns:a="http://schemas.openxmlformats.org/drawingml/2006/main" noChangeAspect="1"/>
-            </wp:cNvGraphicFramePr>
-            <a:graphic xmlns:a="http://schemas.openxmlformats.org/drawingml/2006/main">
-              <a:graphicData uri="http://schemas.openxmlformats.org/drawingml/2006/picture">
-                <pic:pic xmlns:pic="http://schemas.openxmlformats.org/drawingml/2006/picture">
-                  <pic:nvPicPr>
-                    <pic:cNvPr id="845544252" name="Picture 1" descr="A diagram with arrows and a rectangle&#10;&#10;Description automatically generated"/>
-                    <pic:cNvPicPr>
-                      <a:picLocks noChangeAspect="1"/>
-                    </pic:cNvPicPr>
-                  </pic:nvPicPr>
-                  <pic:blipFill>
-                    <a:blip r:embed="rId10"/>
-                    <a:stretch>
-                      <a:fillRect/>
-                    </a:stretch>
-                  </pic:blipFill>
-                  <pic:spPr>
-                    <a:xfrm>
-                      <a:off x="0" y="0"/>
-                      <a:ext cx="5943600" cy="1608455"/>
-                    </a:xfrm>
-                    <a:prstGeom prst="rect">
-                      <a:avLst/>
-                    </a:prstGeom>
-                  </pic:spPr>
-                </pic:pic>
-              </a:graphicData>
-            </a:graphic>
-          </wp:inline>
-        </w:drawing>
-      </w:r>
+      </w:pPr>
     </w:p>
     <w:p>
       <w:pPr>
@@ -25721,26 +25785,13 @@
     </w:p>
     <w:p>
       <w:pPr>
+        <w:pStyle w:val="Heading3"/>
         <w:rPr>
           <w:lang w:val="vi-VN"/>
         </w:rPr>
       </w:pPr>
-    </w:p>
-    <w:p>
-      <w:pPr>
-        <w:rPr>
-          <w:lang w:val="vi-VN"/>
-        </w:rPr>
-      </w:pPr>
-    </w:p>
-    <w:p>
-      <w:pPr>
-        <w:pStyle w:val="Heading3"/>
-        <w:rPr>
-          <w:lang w:val="vi-VN"/>
-        </w:rPr>
-      </w:pPr>
-      <w:bookmarkStart w:id="31" w:name="_Toc189742693"/>
+      <w:bookmarkStart w:id="62" w:name="_Toc190004483"/>
+      <w:bookmarkStart w:id="63" w:name="_Toc189742693"/>
       <w:r>
         <w:rPr>
           <w:lang w:val="vi-VN"/>
@@ -25748,7 +25799,8 @@
         <w:lastRenderedPageBreak/>
         <w:t>Dfd mức 1</w:t>
       </w:r>
-      <w:bookmarkEnd w:id="31"/>
+      <w:bookmarkEnd w:id="62"/>
+      <w:bookmarkEnd w:id="63"/>
     </w:p>
     <w:p>
       <w:r>
@@ -25764,7 +25816,7 @@
           <w:noProof/>
         </w:rPr>
         <w:drawing>
-          <wp:inline distT="0" distB="0" distL="0" distR="0" wp14:anchorId="72B4482C" wp14:editId="0941AC56">
+          <wp:inline distT="0" distB="0" distL="0" distR="0" wp14:anchorId="233F7C5B" wp14:editId="55926C33">
             <wp:extent cx="5943600" cy="1951990"/>
             <wp:effectExtent l="0" t="0" r="0" b="0"/>
             <wp:docPr id="43241185" name="Picture 1" descr="A diagram of a diagram&#10;&#10;Description automatically generated"/>
@@ -25781,7 +25833,7 @@
                     </pic:cNvPicPr>
                   </pic:nvPicPr>
                   <pic:blipFill>
-                    <a:blip r:embed="rId11"/>
+                    <a:blip r:embed="rId14"/>
                     <a:stretch>
                       <a:fillRect/>
                     </a:stretch>
@@ -25817,7 +25869,7 @@
           <w:noProof/>
         </w:rPr>
         <w:drawing>
-          <wp:inline distT="0" distB="0" distL="0" distR="0" wp14:anchorId="377D0588" wp14:editId="524A0547">
+          <wp:inline distT="0" distB="0" distL="0" distR="0" wp14:anchorId="6D4DC2C2" wp14:editId="5B356B56">
             <wp:extent cx="5943600" cy="3561715"/>
             <wp:effectExtent l="0" t="0" r="0" b="635"/>
             <wp:docPr id="975529644" name="Picture 1" descr="A diagram of a computer&#10;&#10;Description automatically generated"/>
@@ -25834,7 +25886,7 @@
                     </pic:cNvPicPr>
                   </pic:nvPicPr>
                   <pic:blipFill>
-                    <a:blip r:embed="rId12"/>
+                    <a:blip r:embed="rId15"/>
                     <a:stretch>
                       <a:fillRect/>
                     </a:stretch>
@@ -25875,7 +25927,7 @@
           <w:noProof/>
         </w:rPr>
         <w:drawing>
-          <wp:inline distT="0" distB="0" distL="0" distR="0" wp14:anchorId="7CB94A95" wp14:editId="6B6F3581">
+          <wp:inline distT="0" distB="0" distL="0" distR="0" wp14:anchorId="2B639A96" wp14:editId="272E25E4">
             <wp:extent cx="5943600" cy="3261995"/>
             <wp:effectExtent l="0" t="0" r="0" b="0"/>
             <wp:docPr id="946010444" name="Picture 1" descr="A diagram of a computer&#10;&#10;Description automatically generated"/>
@@ -25892,7 +25944,7 @@
                     </pic:cNvPicPr>
                   </pic:nvPicPr>
                   <pic:blipFill>
-                    <a:blip r:embed="rId13"/>
+                    <a:blip r:embed="rId16"/>
                     <a:stretch>
                       <a:fillRect/>
                     </a:stretch>
@@ -25940,7 +25992,7 @@
           <w:noProof/>
         </w:rPr>
         <w:drawing>
-          <wp:inline distT="0" distB="0" distL="0" distR="0" wp14:anchorId="24648DFA" wp14:editId="40A769E4">
+          <wp:inline distT="0" distB="0" distL="0" distR="0" wp14:anchorId="3070548D" wp14:editId="60686BF4">
             <wp:extent cx="5943600" cy="4441190"/>
             <wp:effectExtent l="0" t="0" r="0" b="0"/>
             <wp:docPr id="1466400940" name="Picture 1" descr="A diagram of a process&#10;&#10;Description automatically generated with medium confidence"/>
@@ -25957,7 +26009,7 @@
                     </pic:cNvPicPr>
                   </pic:nvPicPr>
                   <pic:blipFill>
-                    <a:blip r:embed="rId14"/>
+                    <a:blip r:embed="rId17"/>
                     <a:stretch>
                       <a:fillRect/>
                     </a:stretch>
@@ -25981,56 +26033,15 @@
     <w:p/>
     <w:p/>
     <w:p>
-      <w:r>
-        <w:t>GMAIL</w:t>
-      </w:r>
-    </w:p>
-    <w:p>
-      <w:r>
-        <w:rPr>
-          <w:noProof/>
-        </w:rPr>
-        <w:drawing>
-          <wp:inline distT="0" distB="0" distL="0" distR="0" wp14:anchorId="719620E6" wp14:editId="277905ED">
-            <wp:extent cx="5943600" cy="1016000"/>
-            <wp:effectExtent l="0" t="0" r="0" b="0"/>
-            <wp:docPr id="962924362" name="Picture 1" descr="A diagram of a message&#10;&#10;Description automatically generated"/>
-            <wp:cNvGraphicFramePr>
-              <a:graphicFrameLocks xmlns:a="http://schemas.openxmlformats.org/drawingml/2006/main" noChangeAspect="1"/>
-            </wp:cNvGraphicFramePr>
-            <a:graphic xmlns:a="http://schemas.openxmlformats.org/drawingml/2006/main">
-              <a:graphicData uri="http://schemas.openxmlformats.org/drawingml/2006/picture">
-                <pic:pic xmlns:pic="http://schemas.openxmlformats.org/drawingml/2006/picture">
-                  <pic:nvPicPr>
-                    <pic:cNvPr id="962924362" name="Picture 1" descr="A diagram of a message&#10;&#10;Description automatically generated"/>
-                    <pic:cNvPicPr>
-                      <a:picLocks noChangeAspect="1"/>
-                    </pic:cNvPicPr>
-                  </pic:nvPicPr>
-                  <pic:blipFill>
-                    <a:blip r:embed="rId15"/>
-                    <a:stretch>
-                      <a:fillRect/>
-                    </a:stretch>
-                  </pic:blipFill>
-                  <pic:spPr>
-                    <a:xfrm>
-                      <a:off x="0" y="0"/>
-                      <a:ext cx="5943600" cy="1016000"/>
-                    </a:xfrm>
-                    <a:prstGeom prst="rect">
-                      <a:avLst/>
-                    </a:prstGeom>
-                  </pic:spPr>
-                </pic:pic>
-              </a:graphicData>
-            </a:graphic>
-          </wp:inline>
-        </w:drawing>
-      </w:r>
+      <w:pPr>
+        <w:rPr>
+          <w:lang w:val="vi-VN"/>
+        </w:rPr>
+      </w:pPr>
     </w:p>
     <w:p/>
     <w:p/>
+    <w:p/>
     <w:p>
       <w:pPr>
         <w:rPr>
@@ -26087,7 +26098,8 @@
           <w:lang w:val="vi-VN"/>
         </w:rPr>
       </w:pPr>
-      <w:bookmarkStart w:id="32" w:name="_Toc189742694"/>
+      <w:bookmarkStart w:id="64" w:name="_Toc189742694"/>
+      <w:bookmarkStart w:id="65" w:name="_Toc190004484"/>
       <w:r>
         <w:t>Dfd mức</w:t>
       </w:r>
@@ -26097,7 +26109,8 @@
         </w:rPr>
         <w:t xml:space="preserve"> 2</w:t>
       </w:r>
-      <w:bookmarkEnd w:id="32"/>
+      <w:bookmarkEnd w:id="64"/>
+      <w:bookmarkEnd w:id="65"/>
     </w:p>
     <w:p>
       <w:pPr>
@@ -26119,7 +26132,7 @@
           <w:lang w:val="vi-VN"/>
         </w:rPr>
         <w:drawing>
-          <wp:inline distT="0" distB="0" distL="0" distR="0" wp14:anchorId="68E51E00" wp14:editId="38BCDC16">
+          <wp:inline distT="0" distB="0" distL="0" distR="0" wp14:anchorId="21025B77" wp14:editId="727BA651">
             <wp:extent cx="5943600" cy="5301615"/>
             <wp:effectExtent l="0" t="0" r="0" b="0"/>
             <wp:docPr id="734740067" name="Picture 1" descr="A diagram of a program&#10;&#10;Description automatically generated"/>
@@ -26136,7 +26149,7 @@
                     </pic:cNvPicPr>
                   </pic:nvPicPr>
                   <pic:blipFill>
-                    <a:blip r:embed="rId16"/>
+                    <a:blip r:embed="rId18"/>
                     <a:stretch>
                       <a:fillRect/>
                     </a:stretch>
@@ -26157,14 +26170,45 @@
         </w:drawing>
       </w:r>
     </w:p>
+    <w:p>
+      <w:pPr>
+        <w:ind w:firstLine="0"/>
+        <w:rPr>
+          <w:lang w:val="vi-VN"/>
+        </w:rPr>
+      </w:pPr>
+    </w:p>
+    <w:p>
+      <w:pPr>
+        <w:ind w:firstLine="0"/>
+        <w:rPr>
+          <w:lang w:val="vi-VN"/>
+        </w:rPr>
+      </w:pPr>
+    </w:p>
+    <w:p>
+      <w:pPr>
+        <w:ind w:firstLine="0"/>
+        <w:rPr>
+          <w:lang w:val="vi-VN"/>
+        </w:rPr>
+      </w:pPr>
+    </w:p>
+    <w:p>
+      <w:pPr>
+        <w:ind w:firstLine="0"/>
+        <w:rPr>
+          <w:lang w:val="vi-VN"/>
+        </w:rPr>
+      </w:pPr>
+    </w:p>
     <w:p/>
-    <w:p/>
-    <w:p/>
     <w:p>
       <w:r>
         <w:rPr>
           <w:lang w:val="vi-VN"/>
         </w:rPr>
+        <w:lastRenderedPageBreak/>
         <w:t>HỌC VIÊN</w:t>
       </w:r>
     </w:p>
@@ -26174,7 +26218,7 @@
           <w:noProof/>
         </w:rPr>
         <w:drawing>
-          <wp:inline distT="0" distB="0" distL="0" distR="0" wp14:anchorId="40541C06" wp14:editId="75C3D876">
+          <wp:inline distT="0" distB="0" distL="0" distR="0" wp14:anchorId="0CA85336" wp14:editId="308CF3BE">
             <wp:extent cx="5943600" cy="4241165"/>
             <wp:effectExtent l="0" t="0" r="0" b="6985"/>
             <wp:docPr id="691697898" name="Picture 1" descr="A diagram with black arrows and white text&#10;&#10;Description automatically generated"/>
@@ -26191,7 +26235,7 @@
                     </pic:cNvPicPr>
                   </pic:nvPicPr>
                   <pic:blipFill>
-                    <a:blip r:embed="rId17"/>
+                    <a:blip r:embed="rId19"/>
                     <a:stretch>
                       <a:fillRect/>
                     </a:stretch>
@@ -26219,7 +26263,7 @@
         </w:rPr>
         <w:lastRenderedPageBreak/>
         <w:drawing>
-          <wp:inline distT="0" distB="0" distL="0" distR="0" wp14:anchorId="75540F3D" wp14:editId="34D9986A">
+          <wp:inline distT="0" distB="0" distL="0" distR="0" wp14:anchorId="2A6F918C" wp14:editId="152F7351">
             <wp:extent cx="5943600" cy="3560445"/>
             <wp:effectExtent l="0" t="0" r="0" b="1905"/>
             <wp:docPr id="2059752667" name="Picture 1" descr="A diagram of a user flow&#10;&#10;Description automatically generated"/>
@@ -26236,7 +26280,7 @@
                     </pic:cNvPicPr>
                   </pic:nvPicPr>
                   <pic:blipFill>
-                    <a:blip r:embed="rId18"/>
+                    <a:blip r:embed="rId20"/>
                     <a:stretch>
                       <a:fillRect/>
                     </a:stretch>
@@ -26342,7 +26386,7 @@
           <w:noProof/>
         </w:rPr>
         <w:drawing>
-          <wp:inline distT="0" distB="0" distL="0" distR="0" wp14:anchorId="1AB8DAB9" wp14:editId="40ABB83C">
+          <wp:inline distT="0" distB="0" distL="0" distR="0" wp14:anchorId="58679A87" wp14:editId="19A01E6A">
             <wp:extent cx="5943600" cy="4070350"/>
             <wp:effectExtent l="0" t="0" r="0" b="6350"/>
             <wp:docPr id="114045387" name="Picture 1" descr="A diagram of a computer&#10;&#10;Description automatically generated"/>
@@ -26359,7 +26403,7 @@
                     </pic:cNvPicPr>
                   </pic:nvPicPr>
                   <pic:blipFill>
-                    <a:blip r:embed="rId19"/>
+                    <a:blip r:embed="rId21"/>
                     <a:stretch>
                       <a:fillRect/>
                     </a:stretch>
@@ -26386,7 +26430,7 @@
           <w:noProof/>
         </w:rPr>
         <w:drawing>
-          <wp:inline distT="0" distB="0" distL="0" distR="0" wp14:anchorId="16C7A526" wp14:editId="041763FF">
+          <wp:inline distT="0" distB="0" distL="0" distR="0" wp14:anchorId="2EBB752B" wp14:editId="688AAFFC">
             <wp:extent cx="5943600" cy="3337560"/>
             <wp:effectExtent l="0" t="0" r="0" b="0"/>
             <wp:docPr id="861125995" name="Picture 1" descr="A diagram of a work flow&#10;&#10;Description automatically generated"/>
@@ -26403,7 +26447,7 @@
                     </pic:cNvPicPr>
                   </pic:nvPicPr>
                   <pic:blipFill>
-                    <a:blip r:embed="rId20"/>
+                    <a:blip r:embed="rId22"/>
                     <a:stretch>
                       <a:fillRect/>
                     </a:stretch>
@@ -26444,7 +26488,7 @@
           <w:noProof/>
         </w:rPr>
         <w:drawing>
-          <wp:inline distT="0" distB="0" distL="0" distR="0" wp14:anchorId="1063E22A" wp14:editId="62E82565">
+          <wp:inline distT="0" distB="0" distL="0" distR="0" wp14:anchorId="2B8E4DAF" wp14:editId="0D470513">
             <wp:extent cx="5943600" cy="3945890"/>
             <wp:effectExtent l="0" t="0" r="0" b="0"/>
             <wp:docPr id="1640978807" name="Picture 1" descr="A diagram of a diagram&#10;&#10;Description automatically generated"/>
@@ -26461,7 +26505,7 @@
                     </pic:cNvPicPr>
                   </pic:nvPicPr>
                   <pic:blipFill>
-                    <a:blip r:embed="rId21"/>
+                    <a:blip r:embed="rId23"/>
                     <a:stretch>
                       <a:fillRect/>
                     </a:stretch>
@@ -26488,7 +26532,7 @@
           <w:noProof/>
         </w:rPr>
         <w:drawing>
-          <wp:inline distT="0" distB="0" distL="0" distR="0" wp14:anchorId="7EEF801C" wp14:editId="4512AC01">
+          <wp:inline distT="0" distB="0" distL="0" distR="0" wp14:anchorId="789A5CDA" wp14:editId="54E904D1">
             <wp:extent cx="5943600" cy="3101975"/>
             <wp:effectExtent l="0" t="0" r="0" b="3175"/>
             <wp:docPr id="1256168857" name="Picture 1" descr="A diagram of a software system&#10;&#10;Description automatically generated with medium confidence"/>
@@ -26505,7 +26549,7 @@
                     </pic:cNvPicPr>
                   </pic:nvPicPr>
                   <pic:blipFill>
-                    <a:blip r:embed="rId22"/>
+                    <a:blip r:embed="rId24"/>
                     <a:stretch>
                       <a:fillRect/>
                     </a:stretch>
@@ -26535,7 +26579,7 @@
         </w:rPr>
         <w:lastRenderedPageBreak/>
         <w:drawing>
-          <wp:inline distT="0" distB="0" distL="0" distR="0" wp14:anchorId="785D89B0" wp14:editId="37781149">
+          <wp:inline distT="0" distB="0" distL="0" distR="0" wp14:anchorId="0A6A95E1" wp14:editId="360484F2">
             <wp:extent cx="5943600" cy="6271895"/>
             <wp:effectExtent l="0" t="0" r="0" b="0"/>
             <wp:docPr id="2135920714" name="Picture 1" descr="A diagram of a workflow&#10;&#10;Description automatically generated"/>
@@ -26552,7 +26596,7 @@
                     </pic:cNvPicPr>
                   </pic:nvPicPr>
                   <pic:blipFill>
-                    <a:blip r:embed="rId23"/>
+                    <a:blip r:embed="rId25"/>
                     <a:stretch>
                       <a:fillRect/>
                     </a:stretch>
@@ -26620,7 +26664,8 @@
           <w:lang w:val="vi-VN"/>
         </w:rPr>
       </w:pPr>
-      <w:bookmarkStart w:id="33" w:name="_Toc189742695"/>
+      <w:bookmarkStart w:id="66" w:name="_Toc189742695"/>
+      <w:bookmarkStart w:id="67" w:name="_Toc190004485"/>
       <w:r>
         <w:rPr>
           <w:lang w:val="vi-VN"/>
@@ -26628,7 +26673,8 @@
         <w:lastRenderedPageBreak/>
         <w:t>Dfd mức 3</w:t>
       </w:r>
-      <w:bookmarkEnd w:id="33"/>
+      <w:bookmarkEnd w:id="66"/>
+      <w:bookmarkEnd w:id="67"/>
     </w:p>
     <w:p>
       <w:pPr>
@@ -26655,7 +26701,7 @@
           <w:lang w:val="vi-VN"/>
         </w:rPr>
         <w:drawing>
-          <wp:inline distT="0" distB="0" distL="0" distR="0" wp14:anchorId="143BEA2D" wp14:editId="59936CDB">
+          <wp:inline distT="0" distB="0" distL="0" distR="0" wp14:anchorId="666D1832" wp14:editId="02461FAB">
             <wp:extent cx="5353685" cy="1476375"/>
             <wp:effectExtent l="0" t="0" r="0" b="9525"/>
             <wp:docPr id="181595649" name="Picture 1" descr="A black line with text&#10;&#10;Description automatically generated with medium confidence"/>
@@ -26672,7 +26718,7 @@
                     </pic:cNvPicPr>
                   </pic:nvPicPr>
                   <pic:blipFill>
-                    <a:blip r:embed="rId24"/>
+                    <a:blip r:embed="rId26"/>
                     <a:stretch>
                       <a:fillRect/>
                     </a:stretch>
@@ -26723,7 +26769,7 @@
           <w:lang w:val="vi-VN"/>
         </w:rPr>
         <w:drawing>
-          <wp:inline distT="0" distB="0" distL="0" distR="0" wp14:anchorId="07C3E35B" wp14:editId="00F5CCB7">
+          <wp:inline distT="0" distB="0" distL="0" distR="0" wp14:anchorId="57398D01" wp14:editId="55E34DCF">
             <wp:extent cx="5943600" cy="3241040"/>
             <wp:effectExtent l="0" t="0" r="0" b="0"/>
             <wp:docPr id="1931495424" name="Picture 1" descr="A diagram of a workflow&#10;&#10;Description automatically generated"/>
@@ -26740,7 +26786,7 @@
                     </pic:cNvPicPr>
                   </pic:nvPicPr>
                   <pic:blipFill>
-                    <a:blip r:embed="rId25"/>
+                    <a:blip r:embed="rId27"/>
                     <a:stretch>
                       <a:fillRect/>
                     </a:stretch>
@@ -26816,7 +26862,7 @@
         </w:rPr>
         <w:lastRenderedPageBreak/>
         <w:drawing>
-          <wp:inline distT="0" distB="0" distL="0" distR="0" wp14:anchorId="70BB33DC" wp14:editId="58C185A5">
+          <wp:inline distT="0" distB="0" distL="0" distR="0" wp14:anchorId="0C2CE501" wp14:editId="315A12EF">
             <wp:extent cx="5943600" cy="4603750"/>
             <wp:effectExtent l="0" t="0" r="0" b="6350"/>
             <wp:docPr id="995175564" name="Picture 1" descr="A diagram of a diagram&#10;&#10;Description automatically generated"/>
@@ -26833,7 +26879,7 @@
                     </pic:cNvPicPr>
                   </pic:nvPicPr>
                   <pic:blipFill>
-                    <a:blip r:embed="rId26"/>
+                    <a:blip r:embed="rId28"/>
                     <a:stretch>
                       <a:fillRect/>
                     </a:stretch>
@@ -26968,7 +27014,7 @@
           <w:noProof/>
         </w:rPr>
         <w:drawing>
-          <wp:inline distT="0" distB="0" distL="0" distR="0" wp14:anchorId="1330E096" wp14:editId="5524A592">
+          <wp:inline distT="0" distB="0" distL="0" distR="0" wp14:anchorId="67951DCF" wp14:editId="5EA576DF">
             <wp:extent cx="5943600" cy="5012690"/>
             <wp:effectExtent l="0" t="0" r="0" b="0"/>
             <wp:docPr id="1569037412" name="Picture 1" descr="A diagram of a workflow&#10;&#10;Description automatically generated"/>
@@ -26985,7 +27031,7 @@
                     </pic:cNvPicPr>
                   </pic:nvPicPr>
                   <pic:blipFill>
-                    <a:blip r:embed="rId27"/>
+                    <a:blip r:embed="rId29"/>
                     <a:stretch>
                       <a:fillRect/>
                     </a:stretch>
@@ -27018,7 +27064,7 @@
         </w:rPr>
         <w:lastRenderedPageBreak/>
         <w:drawing>
-          <wp:inline distT="0" distB="0" distL="0" distR="0" wp14:anchorId="79F0AC06" wp14:editId="21046827">
+          <wp:inline distT="0" distB="0" distL="0" distR="0" wp14:anchorId="0CCE3FB4" wp14:editId="5F6E8513">
             <wp:extent cx="5943600" cy="4722495"/>
             <wp:effectExtent l="0" t="0" r="0" b="1905"/>
             <wp:docPr id="400559872" name="Picture 1" descr="A diagram of a workflow&#10;&#10;Description automatically generated"/>
@@ -27035,7 +27081,7 @@
                     </pic:cNvPicPr>
                   </pic:nvPicPr>
                   <pic:blipFill>
-                    <a:blip r:embed="rId28"/>
+                    <a:blip r:embed="rId30"/>
                     <a:stretch>
                       <a:fillRect/>
                     </a:stretch>
@@ -27068,7 +27114,7 @@
         </w:rPr>
         <w:lastRenderedPageBreak/>
         <w:drawing>
-          <wp:inline distT="0" distB="0" distL="0" distR="0" wp14:anchorId="411C7151" wp14:editId="7B33FF66">
+          <wp:inline distT="0" distB="0" distL="0" distR="0" wp14:anchorId="2DF41BF2" wp14:editId="08E0D7ED">
             <wp:extent cx="5943600" cy="6080760"/>
             <wp:effectExtent l="0" t="0" r="0" b="0"/>
             <wp:docPr id="888725729" name="Picture 1" descr="A diagram of a computer program&#10;&#10;Description automatically generated"/>
@@ -27085,7 +27131,7 @@
                     </pic:cNvPicPr>
                   </pic:nvPicPr>
                   <pic:blipFill>
-                    <a:blip r:embed="rId29"/>
+                    <a:blip r:embed="rId31"/>
                     <a:stretch>
                       <a:fillRect/>
                     </a:stretch>
@@ -27161,7 +27207,7 @@
       </w:pPr>
     </w:p>
     <w:sectPr>
-      <w:footerReference w:type="default" r:id="rId30"/>
+      <w:footerReference w:type="default" r:id="rId32"/>
       <w:type w:val="continuous"/>
       <w:pgSz w:w="12240" w:h="15840"/>
       <w:pgMar w:top="1440" w:right="1440" w:bottom="1440" w:left="1440" w:header="720" w:footer="720" w:gutter="0"/>
@@ -27199,6 +27245,47 @@
 </file>
 
 <file path=word/footer1.xml><?xml version="1.0" encoding="utf-8"?>
+<w:ftr xmlns:wpc="http://schemas.microsoft.com/office/word/2010/wordprocessingCanvas" xmlns:cx="http://schemas.microsoft.com/office/drawing/2014/chartex" xmlns:cx1="http://schemas.microsoft.com/office/drawing/2015/9/8/chartex" xmlns:cx2="http://schemas.microsoft.com/office/drawing/2015/10/21/chartex" xmlns:cx3="http://schemas.microsoft.com/office/drawing/2016/5/9/chartex" xmlns:cx4="http://schemas.microsoft.com/office/drawing/2016/5/10/chartex" xmlns:cx5="http://schemas.microsoft.com/office/drawing/2016/5/11/chartex" xmlns:cx6="http://schemas.microsoft.com/office/drawing/2016/5/12/chartex" xmlns:cx7="http://schemas.microsoft.com/office/drawing/2016/5/13/chartex" xmlns:cx8="http://schemas.microsoft.com/office/drawing/2016/5/14/chartex" xmlns:mc="http://schemas.openxmlformats.org/markup-compatibility/2006" xmlns:aink="http://schemas.microsoft.com/office/drawing/2016/ink" xmlns:am3d="http://schemas.microsoft.com/office/drawing/2017/model3d" xmlns:o="urn:schemas-microsoft-com:office:office" xmlns:oel="http://schemas.microsoft.com/office/2019/extlst" xmlns:r="http://schemas.openxmlformats.org/officeDocument/2006/relationships" xmlns:m="http://schemas.openxmlformats.org/officeDocument/2006/math" xmlns:v="urn:schemas-microsoft-com:vml" xmlns:wp14="http://schemas.microsoft.com/office/word/2010/wordprocessingDrawing" xmlns:wp="http://schemas.openxmlformats.org/drawingml/2006/wordprocessingDrawing" xmlns:w10="urn:schemas-microsoft-com:office:word" xmlns:w="http://schemas.openxmlformats.org/wordprocessingml/2006/main" xmlns:w14="http://schemas.microsoft.com/office/word/2010/wordml" xmlns:w15="http://schemas.microsoft.com/office/word/2012/wordml" xmlns:w16cex="http://schemas.microsoft.com/office/word/2018/wordml/cex" xmlns:w16cid="http://schemas.microsoft.com/office/word/2016/wordml/cid" xmlns:w16="http://schemas.microsoft.com/office/word/2018/wordml" xmlns:w16du="http://schemas.microsoft.com/office/word/2023/wordml/word16du" xmlns:w16sdtdh="http://schemas.microsoft.com/office/word/2020/wordml/sdtdatahash" xmlns:w16sdtfl="http://schemas.microsoft.com/office/word/2024/wordml/sdtformatlock" xmlns:w16se="http://schemas.microsoft.com/office/word/2015/wordml/symex" xmlns:wpg="http://schemas.microsoft.com/office/word/2010/wordprocessingGroup" xmlns:wpi="http://schemas.microsoft.com/office/word/2010/wordprocessingInk" xmlns:wne="http://schemas.microsoft.com/office/word/2006/wordml" xmlns:wps="http://schemas.microsoft.com/office/word/2010/wordprocessingShape" mc:Ignorable="w14 w15 w16se w16cid w16 w16cex w16sdtdh w16sdtfl w16du wp14">
+  <w:sdt>
+    <w:sdtPr>
+      <w:id w:val="549041600"/>
+      <w:docPartObj>
+        <w:docPartGallery w:val="AutoText"/>
+      </w:docPartObj>
+    </w:sdtPr>
+    <w:sdtContent>
+      <w:p>
+        <w:pPr>
+          <w:pStyle w:val="Footer"/>
+          <w:jc w:val="right"/>
+        </w:pPr>
+        <w:r>
+          <w:fldChar w:fldCharType="begin"/>
+        </w:r>
+        <w:r>
+          <w:instrText xml:space="preserve"> PAGE   \* MERGEFORMAT </w:instrText>
+        </w:r>
+        <w:r>
+          <w:fldChar w:fldCharType="separate"/>
+        </w:r>
+        <w:r>
+          <w:t>2</w:t>
+        </w:r>
+        <w:r>
+          <w:fldChar w:fldCharType="end"/>
+        </w:r>
+      </w:p>
+    </w:sdtContent>
+  </w:sdt>
+  <w:p>
+    <w:pPr>
+      <w:pStyle w:val="Footer"/>
+    </w:pPr>
+  </w:p>
+</w:ftr>
+</file>
+
+<file path=word/footer2.xml><?xml version="1.0" encoding="utf-8"?>
 <w:ftr xmlns:wpc="http://schemas.microsoft.com/office/word/2010/wordprocessingCanvas" xmlns:cx="http://schemas.microsoft.com/office/drawing/2014/chartex" xmlns:cx1="http://schemas.microsoft.com/office/drawing/2015/9/8/chartex" xmlns:cx2="http://schemas.microsoft.com/office/drawing/2015/10/21/chartex" xmlns:cx3="http://schemas.microsoft.com/office/drawing/2016/5/9/chartex" xmlns:cx4="http://schemas.microsoft.com/office/drawing/2016/5/10/chartex" xmlns:cx5="http://schemas.microsoft.com/office/drawing/2016/5/11/chartex" xmlns:cx6="http://schemas.microsoft.com/office/drawing/2016/5/12/chartex" xmlns:cx7="http://schemas.microsoft.com/office/drawing/2016/5/13/chartex" xmlns:cx8="http://schemas.microsoft.com/office/drawing/2016/5/14/chartex" xmlns:mc="http://schemas.openxmlformats.org/markup-compatibility/2006" xmlns:aink="http://schemas.microsoft.com/office/drawing/2016/ink" xmlns:am3d="http://schemas.microsoft.com/office/drawing/2017/model3d" xmlns:o="urn:schemas-microsoft-com:office:office" xmlns:oel="http://schemas.microsoft.com/office/2019/extlst" xmlns:r="http://schemas.openxmlformats.org/officeDocument/2006/relationships" xmlns:m="http://schemas.openxmlformats.org/officeDocument/2006/math" xmlns:v="urn:schemas-microsoft-com:vml" xmlns:wp14="http://schemas.microsoft.com/office/word/2010/wordprocessingDrawing" xmlns:wp="http://schemas.openxmlformats.org/drawingml/2006/wordprocessingDrawing" xmlns:w10="urn:schemas-microsoft-com:office:word" xmlns:w="http://schemas.openxmlformats.org/wordprocessingml/2006/main" xmlns:w14="http://schemas.microsoft.com/office/word/2010/wordml" xmlns:w15="http://schemas.microsoft.com/office/word/2012/wordml" xmlns:w16cex="http://schemas.microsoft.com/office/word/2018/wordml/cex" xmlns:w16cid="http://schemas.microsoft.com/office/word/2016/wordml/cid" xmlns:w16="http://schemas.microsoft.com/office/word/2018/wordml" xmlns:w16du="http://schemas.microsoft.com/office/word/2023/wordml/word16du" xmlns:w16sdtdh="http://schemas.microsoft.com/office/word/2020/wordml/sdtdatahash" xmlns:w16sdtfl="http://schemas.microsoft.com/office/word/2024/wordml/sdtformatlock" xmlns:w16se="http://schemas.microsoft.com/office/word/2015/wordml/symex" xmlns:wpg="http://schemas.microsoft.com/office/word/2010/wordprocessingGroup" xmlns:wpi="http://schemas.microsoft.com/office/word/2010/wordprocessingInk" xmlns:wne="http://schemas.microsoft.com/office/word/2006/wordml" xmlns:wps="http://schemas.microsoft.com/office/word/2010/wordprocessingShape" mc:Ignorable="w14 w15 w16se w16cid w16 w16cex w16sdtdh w16sdtfl w16du wp14">
   <w:sdt>
     <w:sdtPr>
@@ -27236,6 +27323,47 @@
 </w:ftr>
 </file>
 
+<file path=word/footer3.xml><?xml version="1.0" encoding="utf-8"?>
+<w:ftr xmlns:wpc="http://schemas.microsoft.com/office/word/2010/wordprocessingCanvas" xmlns:cx="http://schemas.microsoft.com/office/drawing/2014/chartex" xmlns:cx1="http://schemas.microsoft.com/office/drawing/2015/9/8/chartex" xmlns:cx2="http://schemas.microsoft.com/office/drawing/2015/10/21/chartex" xmlns:cx3="http://schemas.microsoft.com/office/drawing/2016/5/9/chartex" xmlns:cx4="http://schemas.microsoft.com/office/drawing/2016/5/10/chartex" xmlns:cx5="http://schemas.microsoft.com/office/drawing/2016/5/11/chartex" xmlns:cx6="http://schemas.microsoft.com/office/drawing/2016/5/12/chartex" xmlns:cx7="http://schemas.microsoft.com/office/drawing/2016/5/13/chartex" xmlns:cx8="http://schemas.microsoft.com/office/drawing/2016/5/14/chartex" xmlns:mc="http://schemas.openxmlformats.org/markup-compatibility/2006" xmlns:aink="http://schemas.microsoft.com/office/drawing/2016/ink" xmlns:am3d="http://schemas.microsoft.com/office/drawing/2017/model3d" xmlns:o="urn:schemas-microsoft-com:office:office" xmlns:oel="http://schemas.microsoft.com/office/2019/extlst" xmlns:r="http://schemas.openxmlformats.org/officeDocument/2006/relationships" xmlns:m="http://schemas.openxmlformats.org/officeDocument/2006/math" xmlns:v="urn:schemas-microsoft-com:vml" xmlns:wp14="http://schemas.microsoft.com/office/word/2010/wordprocessingDrawing" xmlns:wp="http://schemas.openxmlformats.org/drawingml/2006/wordprocessingDrawing" xmlns:w10="urn:schemas-microsoft-com:office:word" xmlns:w="http://schemas.openxmlformats.org/wordprocessingml/2006/main" xmlns:w14="http://schemas.microsoft.com/office/word/2010/wordml" xmlns:w15="http://schemas.microsoft.com/office/word/2012/wordml" xmlns:w16cex="http://schemas.microsoft.com/office/word/2018/wordml/cex" xmlns:w16cid="http://schemas.microsoft.com/office/word/2016/wordml/cid" xmlns:w16="http://schemas.microsoft.com/office/word/2018/wordml" xmlns:w16du="http://schemas.microsoft.com/office/word/2023/wordml/word16du" xmlns:w16sdtdh="http://schemas.microsoft.com/office/word/2020/wordml/sdtdatahash" xmlns:w16sdtfl="http://schemas.microsoft.com/office/word/2024/wordml/sdtformatlock" xmlns:w16se="http://schemas.microsoft.com/office/word/2015/wordml/symex" xmlns:wpg="http://schemas.microsoft.com/office/word/2010/wordprocessingGroup" xmlns:wpi="http://schemas.microsoft.com/office/word/2010/wordprocessingInk" xmlns:wne="http://schemas.microsoft.com/office/word/2006/wordml" xmlns:wps="http://schemas.microsoft.com/office/word/2010/wordprocessingShape" mc:Ignorable="w14 w15 w16se w16cid w16 w16cex w16sdtdh w16sdtfl w16du wp14">
+  <w:sdt>
+    <w:sdtPr>
+      <w:id w:val="-101028916"/>
+      <w:docPartObj>
+        <w:docPartGallery w:val="AutoText"/>
+      </w:docPartObj>
+    </w:sdtPr>
+    <w:sdtContent>
+      <w:p>
+        <w:pPr>
+          <w:pStyle w:val="Footer"/>
+          <w:jc w:val="right"/>
+        </w:pPr>
+        <w:r>
+          <w:fldChar w:fldCharType="begin"/>
+        </w:r>
+        <w:r>
+          <w:instrText xml:space="preserve"> PAGE   \* MERGEFORMAT </w:instrText>
+        </w:r>
+        <w:r>
+          <w:fldChar w:fldCharType="separate"/>
+        </w:r>
+        <w:r>
+          <w:t>2</w:t>
+        </w:r>
+        <w:r>
+          <w:fldChar w:fldCharType="end"/>
+        </w:r>
+      </w:p>
+    </w:sdtContent>
+  </w:sdt>
+  <w:p>
+    <w:pPr>
+      <w:pStyle w:val="Footer"/>
+    </w:pPr>
+  </w:p>
+</w:ftr>
+</file>
+
 <file path=word/footnotes.xml><?xml version="1.0" encoding="utf-8"?>
 <w:footnotes xmlns:wpc="http://schemas.microsoft.com/office/word/2010/wordprocessingCanvas" xmlns:cx="http://schemas.microsoft.com/office/drawing/2014/chartex" xmlns:cx1="http://schemas.microsoft.com/office/drawing/2015/9/8/chartex" xmlns:cx2="http://schemas.microsoft.com/office/drawing/2015/10/21/chartex" xmlns:cx3="http://schemas.microsoft.com/office/drawing/2016/5/9/chartex" xmlns:cx4="http://schemas.microsoft.com/office/drawing/2016/5/10/chartex" xmlns:cx5="http://schemas.microsoft.com/office/drawing/2016/5/11/chartex" xmlns:cx6="http://schemas.microsoft.com/office/drawing/2016/5/12/chartex" xmlns:cx7="http://schemas.microsoft.com/office/drawing/2016/5/13/chartex" xmlns:cx8="http://schemas.microsoft.com/office/drawing/2016/5/14/chartex" xmlns:mc="http://schemas.openxmlformats.org/markup-compatibility/2006" xmlns:aink="http://schemas.microsoft.com/office/drawing/2016/ink" xmlns:am3d="http://schemas.microsoft.com/office/drawing/2017/model3d" xmlns:o="urn:schemas-microsoft-com:office:office" xmlns:oel="http://schemas.microsoft.com/office/2019/extlst" xmlns:r="http://schemas.openxmlformats.org/officeDocument/2006/relationships" xmlns:m="http://schemas.openxmlformats.org/officeDocument/2006/math" xmlns:v="urn:schemas-microsoft-com:vml" xmlns:wp14="http://schemas.microsoft.com/office/word/2010/wordprocessingDrawing" xmlns:wp="http://schemas.openxmlformats.org/drawingml/2006/wordprocessingDrawing" xmlns:w10="urn:schemas-microsoft-com:office:word" xmlns:w="http://schemas.openxmlformats.org/wordprocessingml/2006/main" xmlns:w14="http://schemas.microsoft.com/office/word/2010/wordml" xmlns:w15="http://schemas.microsoft.com/office/word/2012/wordml" xmlns:w16cex="http://schemas.microsoft.com/office/word/2018/wordml/cex" xmlns:w16cid="http://schemas.microsoft.com/office/word/2016/wordml/cid" xmlns:w16="http://schemas.microsoft.com/office/word/2018/wordml" xmlns:w16du="http://schemas.microsoft.com/office/word/2023/wordml/word16du" xmlns:w16sdtdh="http://schemas.microsoft.com/office/word/2020/wordml/sdtdatahash" xmlns:w16sdtfl="http://schemas.microsoft.com/office/word/2024/wordml/sdtformatlock" xmlns:w16se="http://schemas.microsoft.com/office/word/2015/wordml/symex" xmlns:wpg="http://schemas.microsoft.com/office/word/2010/wordprocessingGroup" xmlns:wpi="http://schemas.microsoft.com/office/word/2010/wordprocessingInk" xmlns:wne="http://schemas.microsoft.com/office/word/2006/wordml" xmlns:wps="http://schemas.microsoft.com/office/word/2010/wordprocessingShape" mc:Ignorable="w14 w15 w16se w16cid w16 w16cex w16sdtdh w16sdtfl w16du wp14">
   <w:footnote w:type="separator" w:id="-1">
@@ -27611,13 +27739,13 @@
       </w:rPr>
     </w:lvl>
   </w:abstractNum>
-  <w:num w:numId="1" w16cid:durableId="1860191581">
+  <w:num w:numId="1" w16cid:durableId="179323438">
     <w:abstractNumId w:val="2"/>
   </w:num>
-  <w:num w:numId="2" w16cid:durableId="1493252711">
+  <w:num w:numId="2" w16cid:durableId="1688288990">
     <w:abstractNumId w:val="0"/>
   </w:num>
-  <w:num w:numId="3" w16cid:durableId="1003095539">
+  <w:num w:numId="3" w16cid:durableId="2068264352">
     <w:abstractNumId w:val="1"/>
     <w:lvlOverride w:ilvl="0">
       <w:startOverride w:val="1"/>
@@ -27727,7 +27855,7 @@
     <w:lsdException w:name="Title" w:uiPriority="10" w:qFormat="1"/>
     <w:lsdException w:name="Closing" w:semiHidden="1" w:unhideWhenUsed="1"/>
     <w:lsdException w:name="Signature" w:semiHidden="1" w:unhideWhenUsed="1"/>
-    <w:lsdException w:name="Default Paragraph Font" w:semiHidden="1" w:uiPriority="1" w:unhideWhenUsed="1" w:qFormat="1"/>
+    <w:lsdException w:name="Default Paragraph Font" w:semiHidden="1" w:uiPriority="1" w:unhideWhenUsed="1"/>
     <w:lsdException w:name="Body Text" w:semiHidden="1" w:unhideWhenUsed="1"/>
     <w:lsdException w:name="Body Text Indent" w:semiHidden="1" w:unhideWhenUsed="1"/>
     <w:lsdException w:name="List Continue" w:semiHidden="1" w:unhideWhenUsed="1"/>
@@ -27767,7 +27895,7 @@
     <w:lsdException w:name="HTML Sample" w:semiHidden="1" w:unhideWhenUsed="1"/>
     <w:lsdException w:name="HTML Typewriter" w:semiHidden="1" w:unhideWhenUsed="1"/>
     <w:lsdException w:name="HTML Variable" w:semiHidden="1" w:unhideWhenUsed="1"/>
-    <w:lsdException w:name="Normal Table" w:semiHidden="1" w:unhideWhenUsed="1" w:qFormat="1"/>
+    <w:lsdException w:name="Normal Table" w:semiHidden="1" w:unhideWhenUsed="1"/>
     <w:lsdException w:name="annotation subject" w:semiHidden="1" w:unhideWhenUsed="1"/>
     <w:lsdException w:name="No List" w:semiHidden="1" w:unhideWhenUsed="1"/>
     <w:lsdException w:name="Outline List 1" w:semiHidden="1" w:unhideWhenUsed="1"/>
@@ -28775,14 +28903,13 @@
       <w14:ligatures w14:val="none"/>
     </w:rPr>
   </w:style>
-  <w:style w:type="paragraph" w:styleId="TOCHeading">
-    <w:name w:val="TOC Heading"/>
+  <w:style w:type="paragraph" w:customStyle="1" w:styleId="TOCHeading3">
+    <w:name w:val="TOC Heading3"/>
     <w:basedOn w:val="Heading1"/>
     <w:next w:val="Normal"/>
     <w:uiPriority w:val="39"/>
     <w:unhideWhenUsed/>
     <w:qFormat/>
-    <w:rsid w:val="008F6FC6"/>
     <w:pPr>
       <w:numPr>
         <w:numId w:val="0"/>

</xml_diff>